<commit_message>
1. Adding EDBO+ prerequisites
</commit_message>
<xml_diff>
--- a/Prerequisites/Instructions_Setup.docx
+++ b/Prerequisites/Instructions_Setup.docx
@@ -5,6 +5,7 @@
     <w:p>
       <w:pPr>
         <w:pStyle w:val="Heading1"/>
+        <w:jc w:val="both"/>
         <w:rPr>
           <w:lang w:val="en-US"/>
         </w:rPr>
@@ -33,6 +34,7 @@
     <w:p>
       <w:pPr>
         <w:pStyle w:val="Heading2"/>
+        <w:jc w:val="both"/>
         <w:rPr>
           <w:lang w:val="en-US"/>
         </w:rPr>
@@ -61,6 +63,7 @@
     <w:p>
       <w:pPr>
         <w:pStyle w:val="Heading3"/>
+        <w:jc w:val="both"/>
         <w:rPr>
           <w:lang w:val="en-US"/>
         </w:rPr>
@@ -81,6 +84,7 @@
     <w:p>
       <w:pPr>
         <w:pStyle w:val="Heading4"/>
+        <w:jc w:val="both"/>
         <w:rPr>
           <w:lang w:val="en-US" w:eastAsia="es-ES"/>
         </w:rPr>
@@ -94,6 +98,7 @@
     </w:p>
     <w:p>
       <w:pPr>
+        <w:jc w:val="both"/>
         <w:rPr>
           <w:lang w:val="en-US" w:eastAsia="es-ES"/>
         </w:rPr>
@@ -125,6 +130,7 @@
     </w:p>
     <w:p>
       <w:pPr>
+        <w:jc w:val="both"/>
         <w:rPr>
           <w:lang w:val="en-US" w:eastAsia="es-ES"/>
         </w:rPr>
@@ -173,6 +179,7 @@
     </w:p>
     <w:p>
       <w:pPr>
+        <w:jc w:val="both"/>
         <w:rPr>
           <w:lang w:val="en-US" w:eastAsia="es-ES"/>
         </w:rPr>
@@ -217,6 +224,7 @@
     <w:p>
       <w:pPr>
         <w:pStyle w:val="Heading4"/>
+        <w:jc w:val="both"/>
         <w:rPr>
           <w:lang w:val="en-US" w:eastAsia="es-ES"/>
         </w:rPr>
@@ -232,6 +240,7 @@
     </w:p>
     <w:p>
       <w:pPr>
+        <w:jc w:val="both"/>
         <w:rPr>
           <w:lang w:val="en-US" w:eastAsia="es-ES"/>
         </w:rPr>
@@ -275,6 +284,7 @@
     </w:p>
     <w:p>
       <w:pPr>
+        <w:jc w:val="both"/>
         <w:rPr>
           <w:lang w:val="en-US" w:eastAsia="es-ES"/>
         </w:rPr>
@@ -333,6 +343,7 @@
     </w:p>
     <w:p>
       <w:pPr>
+        <w:jc w:val="both"/>
         <w:rPr>
           <w:lang w:val="en-US" w:eastAsia="es-ES"/>
         </w:rPr>
@@ -376,6 +387,7 @@
     </w:p>
     <w:p>
       <w:pPr>
+        <w:jc w:val="both"/>
         <w:rPr>
           <w:lang w:val="en-US" w:eastAsia="es-ES"/>
         </w:rPr>
@@ -384,6 +396,7 @@
     <w:p>
       <w:pPr>
         <w:pStyle w:val="Heading4"/>
+        <w:jc w:val="both"/>
         <w:rPr>
           <w:lang w:val="en-US" w:eastAsia="es-ES"/>
         </w:rPr>
@@ -397,6 +410,7 @@
     </w:p>
     <w:p>
       <w:pPr>
+        <w:jc w:val="both"/>
         <w:rPr>
           <w:lang w:val="en-US" w:eastAsia="es-ES"/>
         </w:rPr>
@@ -422,6 +436,7 @@
     </w:p>
     <w:p>
       <w:pPr>
+        <w:jc w:val="both"/>
         <w:rPr>
           <w:lang w:val="en-US"/>
         </w:rPr>
@@ -480,6 +495,7 @@
     </w:p>
     <w:p>
       <w:pPr>
+        <w:jc w:val="both"/>
         <w:rPr>
           <w:lang w:val="en-US" w:eastAsia="es-ES"/>
         </w:rPr>
@@ -523,6 +539,7 @@
     </w:p>
     <w:p>
       <w:pPr>
+        <w:jc w:val="both"/>
         <w:rPr>
           <w:lang w:val="en-US"/>
         </w:rPr>
@@ -532,6 +549,7 @@
       <w:pPr>
         <w:pStyle w:val="Heading3"/>
         <w:spacing w:after="240"/>
+        <w:jc w:val="both"/>
         <w:rPr>
           <w:lang w:val="en-US"/>
         </w:rPr>
@@ -620,6 +638,7 @@
     <w:p>
       <w:pPr>
         <w:spacing w:after="240"/>
+        <w:jc w:val="both"/>
         <w:rPr>
           <w:lang w:val="en-US"/>
         </w:rPr>
@@ -671,6 +690,7 @@
         <w:tabs>
           <w:tab w:val="left" w:pos="567"/>
         </w:tabs>
+        <w:jc w:val="both"/>
         <w:rPr>
           <w:rFonts w:eastAsia="Times New Roman" w:cs="Courier New"/>
           <w:kern w:val="0"/>
@@ -745,6 +765,7 @@
         <w:tabs>
           <w:tab w:val="left" w:pos="567"/>
         </w:tabs>
+        <w:jc w:val="both"/>
         <w:rPr>
           <w:rFonts w:eastAsia="Times New Roman" w:cs="Courier New"/>
           <w:kern w:val="0"/>
@@ -760,6 +781,7 @@
         <w:tabs>
           <w:tab w:val="left" w:pos="567"/>
         </w:tabs>
+        <w:jc w:val="both"/>
         <w:rPr>
           <w:rFonts w:eastAsia="Times New Roman" w:cs="Courier New"/>
           <w:b/>
@@ -792,6 +814,7 @@
         <w:tabs>
           <w:tab w:val="left" w:pos="567"/>
         </w:tabs>
+        <w:jc w:val="both"/>
         <w:rPr>
           <w:rFonts w:eastAsia="Times New Roman" w:cs="Courier New"/>
           <w:kern w:val="0"/>
@@ -854,6 +877,7 @@
         <w:tabs>
           <w:tab w:val="left" w:pos="567"/>
         </w:tabs>
+        <w:jc w:val="both"/>
         <w:rPr>
           <w:rFonts w:eastAsia="Times New Roman" w:cs="Courier New"/>
           <w:kern w:val="0"/>
@@ -918,6 +942,7 @@
         <w:tabs>
           <w:tab w:val="left" w:pos="567"/>
         </w:tabs>
+        <w:jc w:val="both"/>
         <w:rPr>
           <w:rFonts w:eastAsia="Times New Roman" w:cs="Courier New"/>
           <w:kern w:val="0"/>
@@ -945,6 +970,7 @@
         <w:tabs>
           <w:tab w:val="left" w:pos="567"/>
         </w:tabs>
+        <w:jc w:val="both"/>
         <w:rPr>
           <w:rFonts w:eastAsia="Times New Roman" w:cs="Courier New"/>
           <w:kern w:val="0"/>
@@ -1044,6 +1070,7 @@
         <w:tabs>
           <w:tab w:val="left" w:pos="567"/>
         </w:tabs>
+        <w:jc w:val="both"/>
         <w:rPr>
           <w:rFonts w:eastAsia="Times New Roman" w:cs="Courier New"/>
           <w:kern w:val="0"/>
@@ -1071,6 +1098,7 @@
         <w:tabs>
           <w:tab w:val="left" w:pos="567"/>
         </w:tabs>
+        <w:jc w:val="both"/>
         <w:rPr>
           <w:rFonts w:eastAsia="Times New Roman" w:cs="Courier New"/>
           <w:kern w:val="0"/>
@@ -1184,6 +1212,7 @@
           <w:tab w:val="left" w:pos="567"/>
         </w:tabs>
         <w:spacing w:after="360"/>
+        <w:jc w:val="both"/>
         <w:rPr>
           <w:rFonts w:eastAsia="Times New Roman" w:cs="Courier New"/>
           <w:kern w:val="0"/>
@@ -1271,6 +1300,7 @@
         <w:tabs>
           <w:tab w:val="left" w:pos="567"/>
         </w:tabs>
+        <w:jc w:val="both"/>
         <w:rPr>
           <w:rFonts w:eastAsia="Times New Roman" w:cs="Courier New"/>
           <w:kern w:val="0"/>
@@ -1299,6 +1329,7 @@
         <w:tabs>
           <w:tab w:val="left" w:pos="567"/>
         </w:tabs>
+        <w:jc w:val="both"/>
         <w:rPr>
           <w:rFonts w:eastAsia="Times New Roman" w:cs="Courier New"/>
           <w:kern w:val="0"/>
@@ -1325,6 +1356,7 @@
         <w:tabs>
           <w:tab w:val="left" w:pos="567"/>
         </w:tabs>
+        <w:jc w:val="both"/>
         <w:rPr>
           <w:rFonts w:eastAsia="Times New Roman" w:cs="Courier New"/>
           <w:kern w:val="0"/>
@@ -1394,6 +1426,7 @@
     </w:p>
     <w:p>
       <w:pPr>
+        <w:jc w:val="both"/>
         <w:rPr>
           <w:lang w:val="en-US"/>
         </w:rPr>
@@ -1402,6 +1435,7 @@
     <w:p>
       <w:pPr>
         <w:pStyle w:val="Heading1"/>
+        <w:jc w:val="both"/>
         <w:rPr>
           <w:lang w:val="en-US"/>
         </w:rPr>
@@ -1423,6 +1457,7 @@
       <w:pPr>
         <w:pStyle w:val="Heading2"/>
         <w:ind w:firstLine="0"/>
+        <w:jc w:val="both"/>
         <w:rPr>
           <w:lang w:val="en-US"/>
         </w:rPr>
@@ -1455,6 +1490,7 @@
     <w:p>
       <w:pPr>
         <w:pStyle w:val="Heading3"/>
+        <w:jc w:val="both"/>
         <w:rPr>
           <w:lang w:val="en-US"/>
         </w:rPr>
@@ -1493,6 +1529,7 @@
     <w:p>
       <w:pPr>
         <w:pStyle w:val="Heading3"/>
+        <w:jc w:val="both"/>
         <w:rPr>
           <w:lang w:val="en-US"/>
         </w:rPr>
@@ -1511,6 +1548,7 @@
       <w:pPr>
         <w:pStyle w:val="Heading2"/>
         <w:ind w:firstLine="0"/>
+        <w:jc w:val="both"/>
         <w:rPr>
           <w:lang w:val="en-US"/>
         </w:rPr>
@@ -1520,6 +1558,7 @@
       <w:pPr>
         <w:pStyle w:val="Heading2"/>
         <w:ind w:firstLine="0"/>
+        <w:jc w:val="both"/>
         <w:rPr>
           <w:lang w:val="en-US"/>
         </w:rPr>
@@ -1564,6 +1603,7 @@
     <w:p>
       <w:pPr>
         <w:pStyle w:val="Heading3"/>
+        <w:jc w:val="both"/>
         <w:rPr>
           <w:lang w:val="en-US"/>
         </w:rPr>
@@ -1590,6 +1630,7 @@
     <w:p>
       <w:pPr>
         <w:pStyle w:val="Heading3"/>
+        <w:jc w:val="both"/>
         <w:rPr>
           <w:lang w:val="en-US"/>
         </w:rPr>
@@ -1621,6 +1662,7 @@
           <w:numId w:val="15"/>
         </w:numPr>
         <w:ind w:left="900" w:firstLine="0"/>
+        <w:jc w:val="both"/>
         <w:rPr>
           <w:lang w:val="en-US"/>
         </w:rPr>
@@ -1644,6 +1686,7 @@
           <w:numId w:val="15"/>
         </w:numPr>
         <w:ind w:left="900" w:firstLine="0"/>
+        <w:jc w:val="both"/>
         <w:rPr>
           <w:lang w:val="en-US"/>
         </w:rPr>
@@ -1665,6 +1708,7 @@
           <w:numId w:val="15"/>
         </w:numPr>
         <w:ind w:left="900" w:firstLine="0"/>
+        <w:jc w:val="both"/>
         <w:rPr>
           <w:lang w:val="en-US"/>
         </w:rPr>
@@ -1686,6 +1730,7 @@
           <w:numId w:val="15"/>
         </w:numPr>
         <w:ind w:left="900" w:firstLine="0"/>
+        <w:jc w:val="both"/>
         <w:rPr>
           <w:lang w:val="en-US"/>
         </w:rPr>
@@ -1707,6 +1752,7 @@
           <w:numId w:val="15"/>
         </w:numPr>
         <w:ind w:left="900" w:firstLine="0"/>
+        <w:jc w:val="both"/>
         <w:rPr>
           <w:lang w:val="en-US"/>
         </w:rPr>
@@ -1722,13 +1768,15 @@
     </w:p>
     <w:p>
       <w:pPr>
-        <w:rPr>
-          <w:lang w:val="en-US"/>
-        </w:rPr>
-      </w:pPr>
-    </w:p>
-    <w:p>
-      <w:pPr>
+        <w:jc w:val="both"/>
+        <w:rPr>
+          <w:lang w:val="en-US"/>
+        </w:rPr>
+      </w:pPr>
+    </w:p>
+    <w:p>
+      <w:pPr>
+        <w:jc w:val="both"/>
         <w:rPr>
           <w:rFonts w:asciiTheme="majorHAnsi" w:eastAsiaTheme="majorEastAsia" w:hAnsiTheme="majorHAnsi" w:cstheme="majorBidi"/>
           <w:color w:val="0F4761" w:themeColor="accent1" w:themeShade="BF"/>
@@ -1771,6 +1819,7 @@
     <w:p>
       <w:pPr>
         <w:pStyle w:val="Heading3"/>
+        <w:jc w:val="both"/>
         <w:rPr>
           <w:lang w:val="en-US"/>
         </w:rPr>
@@ -1797,6 +1846,7 @@
     <w:p>
       <w:pPr>
         <w:pStyle w:val="Heading3"/>
+        <w:jc w:val="both"/>
         <w:rPr>
           <w:lang w:val="en-US"/>
         </w:rPr>
@@ -1877,6 +1927,7 @@
     <w:p>
       <w:pPr>
         <w:pStyle w:val="Heading3"/>
+        <w:jc w:val="both"/>
         <w:rPr>
           <w:lang w:val="en-US"/>
         </w:rPr>
@@ -1903,6 +1954,7 @@
     <w:p>
       <w:pPr>
         <w:pStyle w:val="Heading3"/>
+        <w:jc w:val="both"/>
         <w:rPr>
           <w:lang w:val="en-US"/>
         </w:rPr>
@@ -1928,6 +1980,7 @@
     </w:p>
     <w:p>
       <w:pPr>
+        <w:jc w:val="both"/>
         <w:rPr>
           <w:lang w:val="en-US"/>
         </w:rPr>
@@ -1936,6 +1989,7 @@
     <w:p>
       <w:pPr>
         <w:pStyle w:val="Heading1"/>
+        <w:jc w:val="both"/>
         <w:rPr>
           <w:lang w:val="en-US"/>
         </w:rPr>
@@ -1956,6 +2010,7 @@
     <w:p>
       <w:pPr>
         <w:pStyle w:val="Heading2"/>
+        <w:jc w:val="both"/>
         <w:rPr>
           <w:lang w:val="en-US"/>
         </w:rPr>
@@ -1969,13 +2024,15 @@
     </w:p>
     <w:p>
       <w:pPr>
-        <w:rPr>
-          <w:lang w:val="en-US"/>
-        </w:rPr>
-      </w:pPr>
-    </w:p>
-    <w:p>
-      <w:pPr>
+        <w:jc w:val="both"/>
+        <w:rPr>
+          <w:lang w:val="en-US"/>
+        </w:rPr>
+      </w:pPr>
+    </w:p>
+    <w:p>
+      <w:pPr>
+        <w:jc w:val="both"/>
         <w:rPr>
           <w:i/>
           <w:iCs/>
@@ -2014,6 +2071,7 @@
     </w:p>
     <w:p>
       <w:pPr>
+        <w:jc w:val="both"/>
         <w:rPr>
           <w:lang w:val="en-US"/>
         </w:rPr>
@@ -2061,6 +2119,7 @@
     </w:p>
     <w:p>
       <w:pPr>
+        <w:jc w:val="both"/>
         <w:rPr>
           <w:lang w:val="en-US"/>
         </w:rPr>
@@ -2109,6 +2168,7 @@
     </w:p>
     <w:p>
       <w:pPr>
+        <w:jc w:val="both"/>
         <w:rPr>
           <w:lang w:val="en-US"/>
         </w:rPr>
@@ -2128,6 +2188,7 @@
     </w:p>
     <w:p>
       <w:pPr>
+        <w:jc w:val="both"/>
         <w:rPr>
           <w:lang w:val="en-US"/>
         </w:rPr>
@@ -2137,6 +2198,7 @@
       <w:pPr>
         <w:pStyle w:val="Heading2"/>
         <w:ind w:firstLine="0"/>
+        <w:jc w:val="both"/>
         <w:rPr>
           <w:lang w:val="en-US"/>
         </w:rPr>
@@ -2151,7 +2213,7 @@
         <w:rPr>
           <w:lang w:val="en-US"/>
         </w:rPr>
-        <w:t xml:space="preserve">.2. Create a New Conda Environments (named </w:t>
+        <w:t xml:space="preserve">.2. Create New Conda Environments (named </w:t>
       </w:r>
       <w:proofErr w:type="spellStart"/>
       <w:r>
@@ -2185,6 +2247,7 @@
     <w:p>
       <w:pPr>
         <w:pStyle w:val="Heading3"/>
+        <w:jc w:val="both"/>
         <w:rPr>
           <w:lang w:val="en-US"/>
         </w:rPr>
@@ -2314,6 +2377,7 @@
     </w:p>
     <w:p>
       <w:pPr>
+        <w:jc w:val="both"/>
         <w:rPr>
           <w:lang w:val="en-US"/>
         </w:rPr>
@@ -2369,6 +2433,7 @@
     </w:p>
     <w:p>
       <w:pPr>
+        <w:jc w:val="both"/>
         <w:rPr>
           <w:lang w:val="en-US"/>
         </w:rPr>
@@ -2397,6 +2462,7 @@
     <w:p>
       <w:pPr>
         <w:shd w:val="clear" w:color="auto" w:fill="E8E8E8" w:themeFill="background2"/>
+        <w:jc w:val="both"/>
         <w:rPr>
           <w:lang w:val="en-US"/>
         </w:rPr>
@@ -2440,13 +2506,15 @@
     </w:p>
     <w:p>
       <w:pPr>
-        <w:rPr>
-          <w:lang w:val="en-US"/>
-        </w:rPr>
-      </w:pPr>
-    </w:p>
-    <w:p>
-      <w:pPr>
+        <w:jc w:val="both"/>
+        <w:rPr>
+          <w:lang w:val="en-US"/>
+        </w:rPr>
+      </w:pPr>
+    </w:p>
+    <w:p>
+      <w:pPr>
+        <w:jc w:val="both"/>
         <w:rPr>
           <w:lang w:val="en-US"/>
         </w:rPr>
@@ -2496,6 +2564,7 @@
     </w:p>
     <w:p>
       <w:pPr>
+        <w:jc w:val="both"/>
         <w:rPr>
           <w:lang w:val="en-US"/>
         </w:rPr>
@@ -2544,6 +2613,7 @@
     </w:p>
     <w:p>
       <w:pPr>
+        <w:jc w:val="both"/>
         <w:rPr>
           <w:lang w:val="en-US"/>
         </w:rPr>
@@ -2552,6 +2622,7 @@
     <w:p>
       <w:pPr>
         <w:pStyle w:val="Heading3"/>
+        <w:jc w:val="both"/>
         <w:rPr>
           <w:lang w:val="en-US"/>
         </w:rPr>
@@ -2566,12 +2637,25 @@
         <w:rPr>
           <w:lang w:val="en-US"/>
         </w:rPr>
-        <w:t>.2.2. Enter the two following commands separately. Note some installations may take a few minutes.</w:t>
+        <w:t xml:space="preserve">.2.2. </w:t>
+      </w:r>
+      <w:r>
+        <w:rPr>
+          <w:lang w:val="en-US"/>
+        </w:rPr>
+        <w:t>Execute</w:t>
+      </w:r>
+      <w:r>
+        <w:rPr>
+          <w:lang w:val="en-US"/>
+        </w:rPr>
+        <w:t xml:space="preserve"> the two following commands separately. Note some installations may take a few minutes.</w:t>
       </w:r>
     </w:p>
     <w:p>
       <w:pPr>
         <w:shd w:val="clear" w:color="auto" w:fill="E8E8E8" w:themeFill="background2"/>
+        <w:jc w:val="both"/>
         <w:rPr>
           <w:lang w:val="en-US"/>
         </w:rPr>
@@ -2618,6 +2702,7 @@
     <w:p>
       <w:pPr>
         <w:shd w:val="clear" w:color="auto" w:fill="E8E8E8" w:themeFill="background2"/>
+        <w:jc w:val="both"/>
         <w:rPr>
           <w:lang w:val="en-US"/>
         </w:rPr>
@@ -2649,13 +2734,565 @@
     </w:p>
     <w:p>
       <w:pPr>
-        <w:rPr>
-          <w:lang w:val="en-US"/>
-        </w:rPr>
-      </w:pPr>
-    </w:p>
-    <w:p>
-      <w:pPr>
+        <w:jc w:val="both"/>
+        <w:rPr>
+          <w:lang w:val="en-US"/>
+        </w:rPr>
+      </w:pPr>
+    </w:p>
+    <w:p>
+      <w:pPr>
+        <w:pStyle w:val="Heading2"/>
+        <w:ind w:firstLine="0"/>
+        <w:jc w:val="both"/>
+        <w:rPr>
+          <w:lang w:val="en-US"/>
+        </w:rPr>
+      </w:pPr>
+      <w:r>
+        <w:rPr>
+          <w:lang w:val="en-US"/>
+        </w:rPr>
+        <w:t>4</w:t>
+      </w:r>
+      <w:r>
+        <w:rPr>
+          <w:lang w:val="en-US"/>
+        </w:rPr>
+        <w:t>.</w:t>
+      </w:r>
+      <w:r>
+        <w:rPr>
+          <w:lang w:val="en-US"/>
+        </w:rPr>
+        <w:t>3</w:t>
+      </w:r>
+      <w:r>
+        <w:rPr>
+          <w:lang w:val="en-US"/>
+        </w:rPr>
+        <w:t xml:space="preserve">. Create </w:t>
+      </w:r>
+      <w:r>
+        <w:rPr>
+          <w:lang w:val="en-US"/>
+        </w:rPr>
+        <w:t xml:space="preserve">the </w:t>
+      </w:r>
+      <w:proofErr w:type="spellStart"/>
+      <w:r>
+        <w:rPr>
+          <w:lang w:val="en-US"/>
+        </w:rPr>
+        <w:t>edbo_env</w:t>
+      </w:r>
+      <w:proofErr w:type="spellEnd"/>
+      <w:r>
+        <w:rPr>
+          <w:lang w:val="en-US"/>
+        </w:rPr>
+        <w:t xml:space="preserve"> environment</w:t>
+      </w:r>
+    </w:p>
+    <w:p>
+      <w:pPr>
+        <w:pStyle w:val="Heading3"/>
+        <w:jc w:val="both"/>
+        <w:rPr>
+          <w:lang w:val="en-US"/>
+        </w:rPr>
+      </w:pPr>
+      <w:r>
+        <w:rPr>
+          <w:lang w:val="en-US"/>
+        </w:rPr>
+        <w:t>4</w:t>
+      </w:r>
+      <w:r>
+        <w:rPr>
+          <w:lang w:val="en-US"/>
+        </w:rPr>
+        <w:t>.</w:t>
+      </w:r>
+      <w:r>
+        <w:rPr>
+          <w:lang w:val="en-US"/>
+        </w:rPr>
+        <w:t>3</w:t>
+      </w:r>
+      <w:r>
+        <w:rPr>
+          <w:lang w:val="en-US"/>
+        </w:rPr>
+        <w:t xml:space="preserve">.1. </w:t>
+      </w:r>
+      <w:r>
+        <w:rPr>
+          <w:lang w:val="en-US"/>
+        </w:rPr>
+        <w:t>Go to the “</w:t>
+      </w:r>
+      <w:proofErr w:type="spellStart"/>
+      <w:r>
+        <w:rPr>
+          <w:lang w:val="en-US"/>
+        </w:rPr>
+        <w:t>ML_course</w:t>
+      </w:r>
+      <w:proofErr w:type="spellEnd"/>
+      <w:r>
+        <w:rPr>
+          <w:lang w:val="en-US"/>
+        </w:rPr>
+        <w:t>/</w:t>
+      </w:r>
+      <w:r>
+        <w:rPr>
+          <w:lang w:val="en-US"/>
+        </w:rPr>
+        <w:t>Prerequisites</w:t>
+      </w:r>
+      <w:r>
+        <w:rPr>
+          <w:lang w:val="en-US"/>
+        </w:rPr>
+        <w:t>/</w:t>
+      </w:r>
+      <w:proofErr w:type="spellStart"/>
+      <w:r>
+        <w:rPr>
+          <w:lang w:val="en-US"/>
+        </w:rPr>
+        <w:t>Setup_and_testing</w:t>
+      </w:r>
+      <w:proofErr w:type="spellEnd"/>
+      <w:r>
+        <w:rPr>
+          <w:lang w:val="en-US"/>
+        </w:rPr>
+        <w:t>/</w:t>
+      </w:r>
+      <w:proofErr w:type="spellStart"/>
+      <w:r>
+        <w:rPr>
+          <w:lang w:val="en-US"/>
+        </w:rPr>
+        <w:t>edboplus</w:t>
+      </w:r>
+      <w:proofErr w:type="spellEnd"/>
+      <w:r>
+        <w:rPr>
+          <w:lang w:val="en-US"/>
+        </w:rPr>
+        <w:t>-main</w:t>
+      </w:r>
+      <w:r>
+        <w:rPr>
+          <w:lang w:val="en-US"/>
+        </w:rPr>
+        <w:t>” folder created in step 3. For this, you need to use the “cd” command in the terminal. For example, if your “</w:t>
+      </w:r>
+      <w:proofErr w:type="spellStart"/>
+      <w:r>
+        <w:rPr>
+          <w:lang w:val="en-US"/>
+        </w:rPr>
+        <w:t>ML_course</w:t>
+      </w:r>
+      <w:proofErr w:type="spellEnd"/>
+      <w:r>
+        <w:rPr>
+          <w:lang w:val="en-US"/>
+        </w:rPr>
+        <w:t>/</w:t>
+      </w:r>
+      <w:r>
+        <w:rPr>
+          <w:lang w:val="en-US"/>
+        </w:rPr>
+        <w:t>Prerequisites</w:t>
+      </w:r>
+      <w:r>
+        <w:rPr>
+          <w:lang w:val="en-US"/>
+        </w:rPr>
+        <w:t>/</w:t>
+      </w:r>
+      <w:proofErr w:type="spellStart"/>
+      <w:r>
+        <w:rPr>
+          <w:lang w:val="en-US"/>
+        </w:rPr>
+        <w:t>Setup_and_testing</w:t>
+      </w:r>
+      <w:proofErr w:type="spellEnd"/>
+      <w:r>
+        <w:rPr>
+          <w:lang w:val="en-US"/>
+        </w:rPr>
+        <w:t>/</w:t>
+      </w:r>
+      <w:proofErr w:type="spellStart"/>
+      <w:r>
+        <w:rPr>
+          <w:lang w:val="en-US"/>
+        </w:rPr>
+        <w:t>edboplus</w:t>
+      </w:r>
+      <w:proofErr w:type="spellEnd"/>
+      <w:r>
+        <w:rPr>
+          <w:lang w:val="en-US"/>
+        </w:rPr>
+        <w:t>-main</w:t>
+      </w:r>
+      <w:r>
+        <w:rPr>
+          <w:lang w:val="en-US"/>
+        </w:rPr>
+        <w:t>” folder is in:</w:t>
+      </w:r>
+    </w:p>
+    <w:p>
+      <w:pPr>
+        <w:jc w:val="both"/>
+        <w:rPr>
+          <w:lang w:val="en-US"/>
+        </w:rPr>
+      </w:pPr>
+      <w:r>
+        <w:rPr>
+          <w:lang w:val="en-US"/>
+        </w:rPr>
+        <w:t>C:/Users/</w:t>
+      </w:r>
+      <w:r>
+        <w:rPr>
+          <w:lang w:val="en-US"/>
+        </w:rPr>
+        <w:t>ML_course</w:t>
+      </w:r>
+      <w:r>
+        <w:rPr>
+          <w:lang w:val="en-US"/>
+        </w:rPr>
+        <w:t>/</w:t>
+      </w:r>
+      <w:r>
+        <w:rPr>
+          <w:lang w:val="en-US"/>
+        </w:rPr>
+        <w:t>Prerequisites</w:t>
+      </w:r>
+      <w:r>
+        <w:rPr>
+          <w:lang w:val="en-US"/>
+        </w:rPr>
+        <w:t>/</w:t>
+      </w:r>
+      <w:r>
+        <w:rPr>
+          <w:lang w:val="en-US"/>
+        </w:rPr>
+        <w:t>Setup_and_testing</w:t>
+      </w:r>
+      <w:r>
+        <w:rPr>
+          <w:lang w:val="en-US"/>
+        </w:rPr>
+        <w:t>/</w:t>
+      </w:r>
+      <w:r>
+        <w:rPr>
+          <w:lang w:val="en-US"/>
+        </w:rPr>
+        <w:t>edboplus-main</w:t>
+      </w:r>
+    </w:p>
+    <w:p>
+      <w:pPr>
+        <w:jc w:val="both"/>
+        <w:rPr>
+          <w:lang w:val="en-US"/>
+        </w:rPr>
+      </w:pPr>
+      <w:r>
+        <w:rPr>
+          <w:lang w:val="en-US"/>
+        </w:rPr>
+        <w:lastRenderedPageBreak/>
+        <w:t>You need to type the follow</w:t>
+      </w:r>
+      <w:r>
+        <w:rPr>
+          <w:lang w:val="en-US"/>
+        </w:rPr>
+        <w:t>ing</w:t>
+      </w:r>
+      <w:r>
+        <w:rPr>
+          <w:lang w:val="en-US"/>
+        </w:rPr>
+        <w:t xml:space="preserve"> command in your terminal:</w:t>
+      </w:r>
+    </w:p>
+    <w:p>
+      <w:pPr>
+        <w:shd w:val="clear" w:color="auto" w:fill="E8E8E8" w:themeFill="background2"/>
+        <w:jc w:val="both"/>
+        <w:rPr>
+          <w:lang w:val="en-US"/>
+        </w:rPr>
+      </w:pPr>
+      <w:r>
+        <w:rPr>
+          <w:lang w:val="en-US"/>
+        </w:rPr>
+        <w:t>cd C:/users/</w:t>
+      </w:r>
+      <w:r>
+        <w:rPr>
+          <w:lang w:val="en-US"/>
+        </w:rPr>
+        <w:t>ML_course</w:t>
+      </w:r>
+      <w:r>
+        <w:rPr>
+          <w:lang w:val="en-US"/>
+        </w:rPr>
+        <w:t>/</w:t>
+      </w:r>
+      <w:r>
+        <w:rPr>
+          <w:lang w:val="en-US"/>
+        </w:rPr>
+        <w:t>Prerequisites</w:t>
+      </w:r>
+      <w:r>
+        <w:rPr>
+          <w:lang w:val="en-US"/>
+        </w:rPr>
+        <w:t>/</w:t>
+      </w:r>
+      <w:r>
+        <w:rPr>
+          <w:lang w:val="en-US"/>
+        </w:rPr>
+        <w:t>Setup_and_testing</w:t>
+      </w:r>
+      <w:r>
+        <w:rPr>
+          <w:lang w:val="en-US"/>
+        </w:rPr>
+        <w:t>/</w:t>
+      </w:r>
+      <w:r>
+        <w:rPr>
+          <w:lang w:val="en-US"/>
+        </w:rPr>
+        <w:t>edboplus-main</w:t>
+      </w:r>
+    </w:p>
+    <w:p>
+      <w:pPr>
+        <w:jc w:val="both"/>
+        <w:rPr>
+          <w:lang w:val="en-US"/>
+        </w:rPr>
+      </w:pPr>
+    </w:p>
+    <w:p>
+      <w:pPr>
+        <w:pStyle w:val="Heading3"/>
+        <w:jc w:val="both"/>
+        <w:rPr>
+          <w:lang w:val="en-GB"/>
+        </w:rPr>
+      </w:pPr>
+      <w:r>
+        <w:rPr>
+          <w:lang w:val="en-GB"/>
+        </w:rPr>
+        <w:t xml:space="preserve">4.3.2. </w:t>
+      </w:r>
+      <w:r>
+        <w:rPr>
+          <w:lang w:val="en-US"/>
+        </w:rPr>
+        <w:t>Execute</w:t>
+      </w:r>
+      <w:r>
+        <w:rPr>
+          <w:lang w:val="en-US"/>
+        </w:rPr>
+        <w:t xml:space="preserve"> the </w:t>
+      </w:r>
+      <w:r>
+        <w:rPr>
+          <w:lang w:val="en-US"/>
+        </w:rPr>
+        <w:t>three</w:t>
+      </w:r>
+      <w:r>
+        <w:rPr>
+          <w:lang w:val="en-US"/>
+        </w:rPr>
+        <w:t xml:space="preserve"> following commands</w:t>
+      </w:r>
+      <w:r>
+        <w:rPr>
+          <w:lang w:val="en-US"/>
+        </w:rPr>
+        <w:t xml:space="preserve"> separately:</w:t>
+      </w:r>
+    </w:p>
+    <w:p>
+      <w:pPr>
+        <w:shd w:val="clear" w:color="auto" w:fill="E8E8E8" w:themeFill="background2"/>
+        <w:jc w:val="both"/>
+        <w:rPr>
+          <w:lang w:val="en-US"/>
+        </w:rPr>
+      </w:pPr>
+      <w:proofErr w:type="spellStart"/>
+      <w:r>
+        <w:rPr>
+          <w:lang w:val="en-US"/>
+        </w:rPr>
+        <w:t>conda</w:t>
+      </w:r>
+      <w:proofErr w:type="spellEnd"/>
+      <w:r>
+        <w:rPr>
+          <w:lang w:val="en-US"/>
+        </w:rPr>
+        <w:t xml:space="preserve"> create --name </w:t>
+      </w:r>
+      <w:proofErr w:type="spellStart"/>
+      <w:r>
+        <w:rPr>
+          <w:lang w:val="en-US"/>
+        </w:rPr>
+        <w:t>edbo_env</w:t>
+      </w:r>
+      <w:proofErr w:type="spellEnd"/>
+      <w:r>
+        <w:rPr>
+          <w:lang w:val="en-US"/>
+        </w:rPr>
+        <w:t xml:space="preserve"> python=3.9</w:t>
+      </w:r>
+    </w:p>
+    <w:p>
+      <w:pPr>
+        <w:shd w:val="clear" w:color="auto" w:fill="E8E8E8" w:themeFill="background2"/>
+        <w:jc w:val="both"/>
+        <w:rPr>
+          <w:lang w:val="es-ES"/>
+        </w:rPr>
+      </w:pPr>
+      <w:proofErr w:type="spellStart"/>
+      <w:r>
+        <w:rPr>
+          <w:lang w:val="es-ES"/>
+        </w:rPr>
+        <w:t>conda</w:t>
+      </w:r>
+      <w:proofErr w:type="spellEnd"/>
+      <w:r>
+        <w:rPr>
+          <w:lang w:val="es-ES"/>
+        </w:rPr>
+        <w:t xml:space="preserve"> </w:t>
+      </w:r>
+      <w:proofErr w:type="spellStart"/>
+      <w:r>
+        <w:rPr>
+          <w:lang w:val="es-ES"/>
+        </w:rPr>
+        <w:t>activate</w:t>
+      </w:r>
+      <w:proofErr w:type="spellEnd"/>
+      <w:r>
+        <w:rPr>
+          <w:lang w:val="es-ES"/>
+        </w:rPr>
+        <w:t xml:space="preserve"> </w:t>
+      </w:r>
+      <w:proofErr w:type="spellStart"/>
+      <w:r>
+        <w:rPr>
+          <w:lang w:val="es-ES"/>
+        </w:rPr>
+        <w:t>edbo_env</w:t>
+      </w:r>
+      <w:proofErr w:type="spellEnd"/>
+      <w:r>
+        <w:rPr>
+          <w:lang w:val="es-ES"/>
+        </w:rPr>
+        <w:t xml:space="preserve"> </w:t>
+      </w:r>
+    </w:p>
+    <w:p>
+      <w:pPr>
+        <w:shd w:val="clear" w:color="auto" w:fill="E8E8E8" w:themeFill="background2"/>
+        <w:jc w:val="both"/>
+        <w:rPr>
+          <w:sz w:val="24"/>
+          <w:szCs w:val="24"/>
+          <w:lang w:val="es-ES"/>
+        </w:rPr>
+      </w:pPr>
+      <w:proofErr w:type="spellStart"/>
+      <w:r>
+        <w:rPr>
+          <w:lang w:val="es-ES"/>
+        </w:rPr>
+        <w:t>pip</w:t>
+      </w:r>
+      <w:proofErr w:type="spellEnd"/>
+      <w:r>
+        <w:rPr>
+          <w:lang w:val="es-ES"/>
+        </w:rPr>
+        <w:t xml:space="preserve"> </w:t>
+      </w:r>
+      <w:proofErr w:type="spellStart"/>
+      <w:r>
+        <w:rPr>
+          <w:lang w:val="es-ES"/>
+        </w:rPr>
+        <w:t>install</w:t>
+      </w:r>
+      <w:proofErr w:type="spellEnd"/>
+      <w:r>
+        <w:rPr>
+          <w:lang w:val="es-ES"/>
+        </w:rPr>
+        <w:t xml:space="preserve"> -</w:t>
+      </w:r>
+      <w:proofErr w:type="gramStart"/>
+      <w:r>
+        <w:rPr>
+          <w:lang w:val="es-ES"/>
+        </w:rPr>
+        <w:t>e .</w:t>
+      </w:r>
+      <w:proofErr w:type="gramEnd"/>
+    </w:p>
+    <w:p>
+      <w:pPr>
+        <w:spacing w:after="360"/>
+        <w:jc w:val="both"/>
+        <w:rPr>
+          <w:lang w:val="es-ES"/>
+        </w:rPr>
+      </w:pPr>
+    </w:p>
+    <w:p>
+      <w:pPr>
+        <w:jc w:val="both"/>
         <w:rPr>
           <w:rFonts w:asciiTheme="majorHAnsi" w:eastAsiaTheme="majorEastAsia" w:hAnsiTheme="majorHAnsi" w:cstheme="majorBidi"/>
           <w:color w:val="0F4761" w:themeColor="accent1" w:themeShade="BF"/>
@@ -2672,11 +3309,9 @@
           <w:szCs w:val="40"/>
           <w:lang w:val="en-US"/>
         </w:rPr>
-        <w:br w:type="page"/>
-      </w:r>
-    </w:p>
-    <w:p>
-      <w:pPr>
+        <w:t xml:space="preserve">5. </w:t>
+      </w:r>
+      <w:r>
         <w:rPr>
           <w:rFonts w:asciiTheme="majorHAnsi" w:eastAsiaTheme="majorEastAsia" w:hAnsiTheme="majorHAnsi" w:cstheme="majorBidi"/>
           <w:color w:val="0F4761" w:themeColor="accent1" w:themeShade="BF"/>
@@ -2684,32 +3319,13 @@
           <w:szCs w:val="40"/>
           <w:lang w:val="en-US"/>
         </w:rPr>
-      </w:pPr>
-      <w:r>
-        <w:rPr>
-          <w:rFonts w:asciiTheme="majorHAnsi" w:eastAsiaTheme="majorEastAsia" w:hAnsiTheme="majorHAnsi" w:cstheme="majorBidi"/>
-          <w:color w:val="0F4761" w:themeColor="accent1" w:themeShade="BF"/>
-          <w:sz w:val="40"/>
-          <w:szCs w:val="40"/>
-          <w:lang w:val="en-US"/>
-        </w:rPr>
-        <w:lastRenderedPageBreak/>
-        <w:t xml:space="preserve">5. </w:t>
-      </w:r>
-      <w:r>
-        <w:rPr>
-          <w:rFonts w:asciiTheme="majorHAnsi" w:eastAsiaTheme="majorEastAsia" w:hAnsiTheme="majorHAnsi" w:cstheme="majorBidi"/>
-          <w:color w:val="0F4761" w:themeColor="accent1" w:themeShade="BF"/>
-          <w:sz w:val="40"/>
-          <w:szCs w:val="40"/>
-          <w:lang w:val="en-US"/>
-        </w:rPr>
         <w:t>How to use Visual Studio Code and check the set up</w:t>
       </w:r>
     </w:p>
     <w:p>
       <w:pPr>
         <w:pStyle w:val="Heading3"/>
+        <w:jc w:val="both"/>
         <w:rPr>
           <w:u w:val="single"/>
           <w:lang w:val="en-US"/>
@@ -2749,6 +3365,7 @@
     <w:p>
       <w:pPr>
         <w:pStyle w:val="Heading3"/>
+        <w:jc w:val="both"/>
         <w:rPr>
           <w:lang w:val="en-US"/>
         </w:rPr>
@@ -2886,6 +3503,7 @@
     </w:p>
     <w:p>
       <w:pPr>
+        <w:jc w:val="both"/>
         <w:rPr>
           <w:lang w:val="en-US"/>
         </w:rPr>
@@ -2922,6 +3540,7 @@
     <w:p>
       <w:pPr>
         <w:pStyle w:val="Heading3"/>
+        <w:jc w:val="both"/>
         <w:rPr>
           <w:b/>
           <w:bCs/>
@@ -2980,6 +3599,7 @@
     </w:p>
     <w:p>
       <w:pPr>
+        <w:jc w:val="both"/>
         <w:rPr>
           <w:lang w:val="en-US"/>
         </w:rPr>
@@ -3046,6 +3666,7 @@
     </w:p>
     <w:p>
       <w:pPr>
+        <w:jc w:val="both"/>
         <w:rPr>
           <w:lang w:val="en-US"/>
         </w:rPr>
@@ -3107,6 +3728,7 @@
     </w:p>
     <w:p>
       <w:pPr>
+        <w:jc w:val="both"/>
         <w:rPr>
           <w:lang w:val="en-US"/>
         </w:rPr>
@@ -3115,14 +3737,16 @@
     <w:p>
       <w:pPr>
         <w:pStyle w:val="Heading3"/>
-        <w:rPr>
-          <w:lang w:val="en-US"/>
-        </w:rPr>
-      </w:pPr>
-      <w:r>
-        <w:rPr>
-          <w:lang w:val="en-US"/>
-        </w:rPr>
+        <w:jc w:val="both"/>
+        <w:rPr>
+          <w:lang w:val="en-US"/>
+        </w:rPr>
+      </w:pPr>
+      <w:r>
+        <w:rPr>
+          <w:lang w:val="en-US"/>
+        </w:rPr>
+        <w:lastRenderedPageBreak/>
         <w:t>5.</w:t>
       </w:r>
       <w:r>
@@ -3166,6 +3790,7 @@
     </w:p>
     <w:p>
       <w:pPr>
+        <w:jc w:val="both"/>
         <w:rPr>
           <w:lang w:val="en-US"/>
         </w:rPr>
@@ -3214,6 +3839,7 @@
     </w:p>
     <w:p>
       <w:pPr>
+        <w:jc w:val="both"/>
         <w:rPr>
           <w:lang w:val="en-US"/>
         </w:rPr>
@@ -3222,6 +3848,7 @@
     <w:p>
       <w:pPr>
         <w:pStyle w:val="Heading3"/>
+        <w:jc w:val="both"/>
         <w:rPr>
           <w:i/>
           <w:iCs/>
@@ -3232,7 +3859,6 @@
         <w:rPr>
           <w:lang w:val="en-US"/>
         </w:rPr>
-        <w:lastRenderedPageBreak/>
         <w:t>5.</w:t>
       </w:r>
       <w:r>
@@ -3370,6 +3996,7 @@
     </w:p>
     <w:p>
       <w:pPr>
+        <w:jc w:val="both"/>
         <w:rPr>
           <w:lang w:val="en-US"/>
         </w:rPr>
@@ -3426,6 +4053,7 @@
     <w:p>
       <w:pPr>
         <w:pStyle w:val="Heading3"/>
+        <w:jc w:val="both"/>
         <w:rPr>
           <w:szCs w:val="24"/>
           <w:lang w:val="en-US"/>
@@ -3453,16 +4081,14 @@
         <w:rPr>
           <w:lang w:val="en-US"/>
         </w:rPr>
-        <w:t xml:space="preserve">Check that each cell indicates that the library or program </w:t>
-      </w:r>
-      <w:proofErr w:type="gramStart"/>
-      <w:r>
-        <w:rPr>
-          <w:lang w:val="en-US"/>
-        </w:rPr>
-        <w:t>have</w:t>
-      </w:r>
-      <w:proofErr w:type="gramEnd"/>
+        <w:t>Check that each cell indicates that the library or program ha</w:t>
+      </w:r>
+      <w:r>
+        <w:rPr>
+          <w:lang w:val="en-US"/>
+        </w:rPr>
+        <w:t>s</w:t>
+      </w:r>
       <w:r>
         <w:rPr>
           <w:lang w:val="en-US"/>
@@ -3479,6 +4105,7 @@
     </w:p>
     <w:p>
       <w:pPr>
+        <w:jc w:val="both"/>
         <w:rPr>
           <w:sz w:val="24"/>
           <w:szCs w:val="24"/>
@@ -3590,6 +4217,7 @@
     </w:p>
     <w:p>
       <w:pPr>
+        <w:jc w:val="both"/>
         <w:rPr>
           <w:sz w:val="24"/>
           <w:szCs w:val="24"/>
@@ -3600,6 +4228,7 @@
     <w:p>
       <w:pPr>
         <w:pStyle w:val="Heading3"/>
+        <w:jc w:val="both"/>
         <w:rPr>
           <w:u w:val="single"/>
           <w:lang w:val="en-US"/>
@@ -3632,6 +4261,7 @@
     <w:p>
       <w:pPr>
         <w:pStyle w:val="Heading3"/>
+        <w:jc w:val="both"/>
         <w:rPr>
           <w:lang w:val="en-US"/>
         </w:rPr>
@@ -3770,6 +4400,7 @@
     <w:p>
       <w:pPr>
         <w:pStyle w:val="Heading3"/>
+        <w:jc w:val="both"/>
         <w:rPr>
           <w:lang w:val="en-US"/>
         </w:rPr>
@@ -3816,7 +4447,19 @@
         <w:rPr>
           <w:lang w:val="en-US"/>
         </w:rPr>
-        <w:t xml:space="preserve"> (see step 5.2, but this time with </w:t>
+        <w:t xml:space="preserve"> (see step 5.</w:t>
+      </w:r>
+      <w:r>
+        <w:rPr>
+          <w:lang w:val="en-US"/>
+        </w:rPr>
+        <w:t>1.</w:t>
+      </w:r>
+      <w:r>
+        <w:rPr>
+          <w:lang w:val="en-US"/>
+        </w:rPr>
+        <w:t xml:space="preserve">2, but this time with </w:t>
       </w:r>
       <w:r>
         <w:rPr>
@@ -3848,6 +4491,7 @@
     <w:p>
       <w:pPr>
         <w:pStyle w:val="Heading3"/>
+        <w:jc w:val="both"/>
         <w:rPr>
           <w:i/>
           <w:iCs/>
@@ -3918,7 +4562,7 @@
         <w:rPr>
           <w:lang w:val="en-US"/>
         </w:rPr>
-        <w:t xml:space="preserve">clicking “Run All” (image), </w:t>
+        <w:t xml:space="preserve">clicking “Run All”, </w:t>
       </w:r>
       <w:r>
         <w:rPr>
@@ -3990,12 +4634,31 @@
           <w:iCs/>
           <w:lang w:val="en-US"/>
         </w:rPr>
-        <w:t xml:space="preserve"> (see step 5.3)</w:t>
+        <w:t xml:space="preserve"> </w:t>
+      </w:r>
+      <w:r>
+        <w:rPr>
+          <w:lang w:val="en-US"/>
+        </w:rPr>
+        <w:t>(see step 5.</w:t>
+      </w:r>
+      <w:r>
+        <w:rPr>
+          <w:lang w:val="en-US"/>
+        </w:rPr>
+        <w:t>1.</w:t>
+      </w:r>
+      <w:r>
+        <w:rPr>
+          <w:lang w:val="en-US"/>
+        </w:rPr>
+        <w:t>3)</w:t>
       </w:r>
     </w:p>
     <w:p>
       <w:pPr>
         <w:pStyle w:val="Heading3"/>
+        <w:jc w:val="both"/>
         <w:rPr>
           <w:lang w:val="en-US"/>
         </w:rPr>
@@ -4022,16 +4685,14 @@
         <w:rPr>
           <w:lang w:val="en-US"/>
         </w:rPr>
-        <w:t xml:space="preserve">Check that each cell indicates that the library or program </w:t>
-      </w:r>
-      <w:proofErr w:type="gramStart"/>
-      <w:r>
-        <w:rPr>
-          <w:lang w:val="en-US"/>
-        </w:rPr>
-        <w:t>have</w:t>
-      </w:r>
-      <w:proofErr w:type="gramEnd"/>
+        <w:t>Check that each cell indicates that the library or program ha</w:t>
+      </w:r>
+      <w:r>
+        <w:rPr>
+          <w:lang w:val="en-US"/>
+        </w:rPr>
+        <w:t>s</w:t>
+      </w:r>
       <w:r>
         <w:rPr>
           <w:lang w:val="en-US"/>
@@ -4041,6 +4702,7 @@
     </w:p>
     <w:p>
       <w:pPr>
+        <w:jc w:val="both"/>
         <w:rPr>
           <w:sz w:val="24"/>
           <w:szCs w:val="24"/>
@@ -4142,7 +4804,583 @@
     </w:p>
     <w:p>
       <w:pPr>
-        <w:rPr>
+        <w:jc w:val="both"/>
+        <w:rPr>
+          <w:sz w:val="24"/>
+          <w:szCs w:val="24"/>
+          <w:lang w:val="en-US"/>
+        </w:rPr>
+      </w:pPr>
+    </w:p>
+    <w:p>
+      <w:pPr>
+        <w:pStyle w:val="Heading3"/>
+        <w:jc w:val="both"/>
+        <w:rPr>
+          <w:u w:val="single"/>
+          <w:lang w:val="en-US"/>
+        </w:rPr>
+      </w:pPr>
+      <w:r>
+        <w:rPr>
+          <w:u w:val="single"/>
+          <w:lang w:val="en-US"/>
+        </w:rPr>
+        <w:lastRenderedPageBreak/>
+        <w:t>5.</w:t>
+      </w:r>
+      <w:r>
+        <w:rPr>
+          <w:u w:val="single"/>
+          <w:lang w:val="en-US"/>
+        </w:rPr>
+        <w:t>3</w:t>
+      </w:r>
+      <w:r>
+        <w:rPr>
+          <w:u w:val="single"/>
+          <w:lang w:val="en-US"/>
+        </w:rPr>
+        <w:t xml:space="preserve">. </w:t>
+      </w:r>
+      <w:proofErr w:type="spellStart"/>
+      <w:r>
+        <w:rPr>
+          <w:u w:val="single"/>
+          <w:lang w:val="en-US"/>
+        </w:rPr>
+        <w:t>edbo_env</w:t>
+      </w:r>
+      <w:proofErr w:type="spellEnd"/>
+      <w:r>
+        <w:rPr>
+          <w:u w:val="single"/>
+          <w:lang w:val="en-US"/>
+        </w:rPr>
+        <w:t xml:space="preserve"> </w:t>
+      </w:r>
+      <w:r>
+        <w:rPr>
+          <w:u w:val="single"/>
+          <w:lang w:val="en-US"/>
+        </w:rPr>
+        <w:t>environment</w:t>
+      </w:r>
+    </w:p>
+    <w:p>
+      <w:pPr>
+        <w:pStyle w:val="Heading3"/>
+        <w:jc w:val="both"/>
+        <w:rPr>
+          <w:lang w:val="en-US"/>
+        </w:rPr>
+      </w:pPr>
+      <w:r>
+        <w:rPr>
+          <w:lang w:val="en-US"/>
+        </w:rPr>
+        <w:t>5.</w:t>
+      </w:r>
+      <w:r>
+        <w:rPr>
+          <w:lang w:val="en-US"/>
+        </w:rPr>
+        <w:t>3</w:t>
+      </w:r>
+      <w:r>
+        <w:rPr>
+          <w:lang w:val="en-US"/>
+        </w:rPr>
+        <w:t xml:space="preserve">.1. </w:t>
+      </w:r>
+      <w:r>
+        <w:rPr>
+          <w:lang w:val="en-US"/>
+        </w:rPr>
+        <w:t>Open, using VSC, the “</w:t>
+      </w:r>
+      <w:proofErr w:type="spellStart"/>
+      <w:r>
+        <w:rPr>
+          <w:lang w:val="en-US"/>
+        </w:rPr>
+        <w:t>EDBO_course_</w:t>
+      </w:r>
+      <w:proofErr w:type="gramStart"/>
+      <w:r>
+        <w:rPr>
+          <w:lang w:val="en-US"/>
+        </w:rPr>
+        <w:t>setup</w:t>
+      </w:r>
+      <w:r>
+        <w:rPr>
+          <w:lang w:val="en-US"/>
+        </w:rPr>
+        <w:t>.ipynb</w:t>
+      </w:r>
+      <w:proofErr w:type="spellEnd"/>
+      <w:proofErr w:type="gramEnd"/>
+      <w:r>
+        <w:rPr>
+          <w:lang w:val="en-US"/>
+        </w:rPr>
+        <w:t xml:space="preserve">” </w:t>
+      </w:r>
+      <w:proofErr w:type="spellStart"/>
+      <w:r>
+        <w:rPr>
+          <w:lang w:val="en-US"/>
+        </w:rPr>
+        <w:t>Jupyter</w:t>
+      </w:r>
+      <w:proofErr w:type="spellEnd"/>
+      <w:r>
+        <w:rPr>
+          <w:lang w:val="en-US"/>
+        </w:rPr>
+        <w:t xml:space="preserve"> Notebook unzipped from the previous step</w:t>
+      </w:r>
+      <w:r>
+        <w:rPr>
+          <w:lang w:val="en-US"/>
+        </w:rPr>
+        <w:t xml:space="preserve"> (in the “</w:t>
+      </w:r>
+      <w:proofErr w:type="spellStart"/>
+      <w:r>
+        <w:rPr>
+          <w:lang w:val="en-US"/>
+        </w:rPr>
+        <w:t>ML_course</w:t>
+      </w:r>
+      <w:proofErr w:type="spellEnd"/>
+      <w:r>
+        <w:rPr>
+          <w:lang w:val="en-US"/>
+        </w:rPr>
+        <w:t>/</w:t>
+      </w:r>
+      <w:r>
+        <w:rPr>
+          <w:lang w:val="en-US"/>
+        </w:rPr>
+        <w:t>Prerequisites</w:t>
+      </w:r>
+      <w:r>
+        <w:rPr>
+          <w:lang w:val="en-US"/>
+        </w:rPr>
+        <w:t>/</w:t>
+      </w:r>
+      <w:proofErr w:type="spellStart"/>
+      <w:r>
+        <w:rPr>
+          <w:lang w:val="en-US"/>
+        </w:rPr>
+        <w:t>Setup_and_testing</w:t>
+      </w:r>
+      <w:proofErr w:type="spellEnd"/>
+      <w:r>
+        <w:rPr>
+          <w:lang w:val="en-US"/>
+        </w:rPr>
+        <w:t>” folder)</w:t>
+      </w:r>
+      <w:r>
+        <w:rPr>
+          <w:lang w:val="en-US"/>
+        </w:rPr>
+        <w:t>.</w:t>
+      </w:r>
+    </w:p>
+    <w:p>
+      <w:pPr>
+        <w:pStyle w:val="Heading3"/>
+        <w:jc w:val="both"/>
+        <w:rPr>
+          <w:lang w:val="en-US"/>
+        </w:rPr>
+      </w:pPr>
+      <w:r>
+        <w:rPr>
+          <w:lang w:val="en-US"/>
+        </w:rPr>
+        <w:t>5.</w:t>
+      </w:r>
+      <w:r>
+        <w:rPr>
+          <w:lang w:val="en-US"/>
+        </w:rPr>
+        <w:t>3</w:t>
+      </w:r>
+      <w:r>
+        <w:rPr>
+          <w:lang w:val="en-US"/>
+        </w:rPr>
+        <w:t xml:space="preserve">.2. </w:t>
+      </w:r>
+      <w:r>
+        <w:rPr>
+          <w:lang w:val="en-US"/>
+        </w:rPr>
+        <w:t xml:space="preserve">When VSC opens, select the </w:t>
+      </w:r>
+      <w:proofErr w:type="spellStart"/>
+      <w:r>
+        <w:rPr>
+          <w:lang w:val="en-US"/>
+        </w:rPr>
+        <w:t>edbo_env</w:t>
+      </w:r>
+      <w:proofErr w:type="spellEnd"/>
+      <w:r>
+        <w:rPr>
+          <w:lang w:val="en-US"/>
+        </w:rPr>
+        <w:t xml:space="preserve"> </w:t>
+      </w:r>
+      <w:r>
+        <w:rPr>
+          <w:lang w:val="en-US"/>
+        </w:rPr>
+        <w:t>kernel</w:t>
+      </w:r>
+      <w:r>
+        <w:rPr>
+          <w:lang w:val="en-US"/>
+        </w:rPr>
+        <w:t xml:space="preserve"> (see step 5.1.2, but this time with “</w:t>
+      </w:r>
+      <w:proofErr w:type="spellStart"/>
+      <w:r>
+        <w:rPr>
+          <w:lang w:val="en-US"/>
+        </w:rPr>
+        <w:t>edbo_env</w:t>
+      </w:r>
+      <w:proofErr w:type="spellEnd"/>
+      <w:r>
+        <w:rPr>
+          <w:lang w:val="en-US"/>
+        </w:rPr>
+        <w:t>”)</w:t>
+      </w:r>
+    </w:p>
+    <w:p>
+      <w:pPr>
+        <w:pStyle w:val="Heading3"/>
+        <w:jc w:val="both"/>
+        <w:rPr>
+          <w:i/>
+          <w:iCs/>
+          <w:lang w:val="en-US"/>
+        </w:rPr>
+      </w:pPr>
+      <w:r>
+        <w:rPr>
+          <w:lang w:val="en-US"/>
+        </w:rPr>
+        <w:t>5.</w:t>
+      </w:r>
+      <w:r>
+        <w:rPr>
+          <w:lang w:val="en-US"/>
+        </w:rPr>
+        <w:t>3</w:t>
+      </w:r>
+      <w:r>
+        <w:rPr>
+          <w:lang w:val="en-US"/>
+        </w:rPr>
+        <w:t xml:space="preserve">.3. </w:t>
+      </w:r>
+      <w:r>
+        <w:rPr>
+          <w:lang w:val="en-US"/>
+        </w:rPr>
+        <w:t xml:space="preserve">Run </w:t>
+      </w:r>
+      <w:r>
+        <w:rPr>
+          <w:lang w:val="en-US"/>
+        </w:rPr>
+        <w:t>the</w:t>
+      </w:r>
+      <w:r>
+        <w:rPr>
+          <w:lang w:val="en-US"/>
+        </w:rPr>
+        <w:t xml:space="preserve"> </w:t>
+      </w:r>
+      <w:r>
+        <w:rPr>
+          <w:lang w:val="en-US"/>
+        </w:rPr>
+        <w:t xml:space="preserve">code </w:t>
+      </w:r>
+      <w:r>
+        <w:rPr>
+          <w:lang w:val="en-US"/>
+        </w:rPr>
+        <w:t>cell</w:t>
+      </w:r>
+      <w:r>
+        <w:rPr>
+          <w:lang w:val="en-US"/>
+        </w:rPr>
+        <w:t>s</w:t>
+      </w:r>
+      <w:r>
+        <w:rPr>
+          <w:lang w:val="en-US"/>
+        </w:rPr>
+        <w:t xml:space="preserve"> by </w:t>
+      </w:r>
+      <w:r>
+        <w:rPr>
+          <w:lang w:val="en-US"/>
+        </w:rPr>
+        <w:t xml:space="preserve">clicking “Run All”, </w:t>
+      </w:r>
+      <w:r>
+        <w:rPr>
+          <w:lang w:val="en-US"/>
+        </w:rPr>
+        <w:t>placing the cursor on each cell an</w:t>
+      </w:r>
+      <w:r>
+        <w:rPr>
+          <w:lang w:val="en-US"/>
+        </w:rPr>
+        <w:t>d</w:t>
+      </w:r>
+      <w:r>
+        <w:rPr>
+          <w:lang w:val="en-US"/>
+        </w:rPr>
+        <w:t xml:space="preserve"> pressing the play button</w:t>
+      </w:r>
+      <w:r>
+        <w:rPr>
+          <w:lang w:val="en-US"/>
+        </w:rPr>
+        <w:t>,</w:t>
+      </w:r>
+      <w:r>
+        <w:rPr>
+          <w:lang w:val="en-US"/>
+        </w:rPr>
+        <w:t xml:space="preserve"> or</w:t>
+      </w:r>
+      <w:r>
+        <w:rPr>
+          <w:lang w:val="en-US"/>
+        </w:rPr>
+        <w:t xml:space="preserve"> pressing</w:t>
+      </w:r>
+      <w:r>
+        <w:rPr>
+          <w:lang w:val="en-US"/>
+        </w:rPr>
+        <w:t xml:space="preserve"> </w:t>
+      </w:r>
+      <w:r>
+        <w:rPr>
+          <w:i/>
+          <w:iCs/>
+          <w:lang w:val="en-US"/>
+        </w:rPr>
+        <w:t xml:space="preserve">Shift </w:t>
+      </w:r>
+      <w:r>
+        <w:rPr>
+          <w:lang w:val="en-US"/>
+        </w:rPr>
+        <w:t xml:space="preserve">+ </w:t>
+      </w:r>
+      <w:r>
+        <w:rPr>
+          <w:i/>
+          <w:iCs/>
+          <w:lang w:val="en-US"/>
+        </w:rPr>
+        <w:t>Enter</w:t>
+      </w:r>
+      <w:r>
+        <w:rPr>
+          <w:i/>
+          <w:iCs/>
+          <w:lang w:val="en-US"/>
+        </w:rPr>
+        <w:t xml:space="preserve"> </w:t>
+      </w:r>
+      <w:r>
+        <w:rPr>
+          <w:lang w:val="en-US"/>
+        </w:rPr>
+        <w:t>(see step 5.1.3)</w:t>
+      </w:r>
+    </w:p>
+    <w:p>
+      <w:pPr>
+        <w:pStyle w:val="Heading3"/>
+        <w:jc w:val="both"/>
+        <w:rPr>
+          <w:lang w:val="en-US"/>
+        </w:rPr>
+      </w:pPr>
+      <w:r>
+        <w:rPr>
+          <w:lang w:val="en-US"/>
+        </w:rPr>
+        <w:t>5.</w:t>
+      </w:r>
+      <w:r>
+        <w:rPr>
+          <w:lang w:val="en-US"/>
+        </w:rPr>
+        <w:t>3</w:t>
+      </w:r>
+      <w:r>
+        <w:rPr>
+          <w:lang w:val="en-US"/>
+        </w:rPr>
+        <w:t xml:space="preserve">.4. </w:t>
+      </w:r>
+      <w:r>
+        <w:rPr>
+          <w:lang w:val="en-US"/>
+        </w:rPr>
+        <w:t>Check that each cell indicates that the library or program ha</w:t>
+      </w:r>
+      <w:r>
+        <w:rPr>
+          <w:lang w:val="en-US"/>
+        </w:rPr>
+        <w:t>s</w:t>
+      </w:r>
+      <w:r>
+        <w:rPr>
+          <w:lang w:val="en-US"/>
+        </w:rPr>
+        <w:t xml:space="preserve"> been installed correctly.</w:t>
+      </w:r>
+    </w:p>
+    <w:p>
+      <w:pPr>
+        <w:jc w:val="both"/>
+        <w:rPr>
+          <w:sz w:val="24"/>
+          <w:szCs w:val="24"/>
+          <w:lang w:val="en-US"/>
+        </w:rPr>
+      </w:pPr>
+      <w:r>
+        <w:rPr>
+          <w:sz w:val="24"/>
+          <w:szCs w:val="24"/>
+          <w:lang w:val="en-US"/>
+        </w:rPr>
+        <w:t>5.</w:t>
+      </w:r>
+      <w:r>
+        <w:rPr>
+          <w:lang w:val="en-US"/>
+        </w:rPr>
+        <w:t>3</w:t>
+      </w:r>
+      <w:r>
+        <w:rPr>
+          <w:lang w:val="en-US"/>
+        </w:rPr>
+        <w:t>.</w:t>
+      </w:r>
+      <w:r>
+        <w:rPr>
+          <w:sz w:val="24"/>
+          <w:szCs w:val="24"/>
+          <w:lang w:val="en-US"/>
+        </w:rPr>
+        <w:t>5. Close the “</w:t>
+      </w:r>
+      <w:proofErr w:type="spellStart"/>
+      <w:r>
+        <w:rPr>
+          <w:lang w:val="en-US"/>
+        </w:rPr>
+        <w:t>EDBO</w:t>
+      </w:r>
+      <w:r>
+        <w:rPr>
+          <w:sz w:val="24"/>
+          <w:szCs w:val="24"/>
+          <w:lang w:val="en-US"/>
+        </w:rPr>
+        <w:t>_course_</w:t>
+      </w:r>
+      <w:proofErr w:type="gramStart"/>
+      <w:r>
+        <w:rPr>
+          <w:sz w:val="24"/>
+          <w:szCs w:val="24"/>
+          <w:lang w:val="en-US"/>
+        </w:rPr>
+        <w:t>setup.ipynb</w:t>
+      </w:r>
+      <w:proofErr w:type="spellEnd"/>
+      <w:proofErr w:type="gramEnd"/>
+      <w:r>
+        <w:rPr>
+          <w:sz w:val="24"/>
+          <w:szCs w:val="24"/>
+          <w:lang w:val="en-US"/>
+        </w:rPr>
+        <w:t xml:space="preserve">” </w:t>
+      </w:r>
+      <w:proofErr w:type="spellStart"/>
+      <w:r>
+        <w:rPr>
+          <w:sz w:val="24"/>
+          <w:szCs w:val="24"/>
+          <w:lang w:val="en-US"/>
+        </w:rPr>
+        <w:t>Jupyter</w:t>
+      </w:r>
+      <w:proofErr w:type="spellEnd"/>
+      <w:r>
+        <w:rPr>
+          <w:sz w:val="24"/>
+          <w:szCs w:val="24"/>
+          <w:lang w:val="en-US"/>
+        </w:rPr>
+        <w:t xml:space="preserve"> Notebook </w:t>
+      </w:r>
+      <w:proofErr w:type="gramStart"/>
+      <w:r>
+        <w:rPr>
+          <w:sz w:val="24"/>
+          <w:szCs w:val="24"/>
+          <w:lang w:val="en-US"/>
+        </w:rPr>
+        <w:t>and,</w:t>
+      </w:r>
+      <w:proofErr w:type="gramEnd"/>
+      <w:r>
+        <w:rPr>
+          <w:sz w:val="24"/>
+          <w:szCs w:val="24"/>
+          <w:lang w:val="en-US"/>
+        </w:rPr>
+        <w:t xml:space="preserve"> then, close VSC.</w:t>
+      </w:r>
+    </w:p>
+    <w:p>
+      <w:pPr>
+        <w:jc w:val="both"/>
+        <w:rPr>
+          <w:sz w:val="24"/>
+          <w:szCs w:val="24"/>
           <w:lang w:val="en-US"/>
         </w:rPr>
       </w:pPr>
@@ -4150,6 +5388,7 @@
     <w:p>
       <w:pPr>
         <w:pStyle w:val="Heading1"/>
+        <w:jc w:val="both"/>
         <w:rPr>
           <w:lang w:val="en-US"/>
         </w:rPr>
@@ -4164,12 +5403,13 @@
         <w:rPr>
           <w:lang w:val="en-US"/>
         </w:rPr>
-        <w:t>Checking the CSV files</w:t>
+        <w:t>Checking CSV files</w:t>
       </w:r>
     </w:p>
     <w:p>
       <w:pPr>
         <w:pStyle w:val="Heading2"/>
+        <w:jc w:val="both"/>
         <w:rPr>
           <w:lang w:val="en-US"/>
         </w:rPr>
@@ -4198,6 +5438,7 @@
     <w:p>
       <w:pPr>
         <w:pStyle w:val="Heading2"/>
+        <w:jc w:val="both"/>
         <w:rPr>
           <w:lang w:val="en-US"/>
         </w:rPr>
@@ -4282,7 +5523,6 @@
         <w:rPr>
           <w:lang w:val="en-US"/>
         </w:rPr>
-        <w:lastRenderedPageBreak/>
         <w:t xml:space="preserve">If when opening a CSV file everything is condensed into a single column, you can change this in </w:t>
       </w:r>
       <w:r>
@@ -4383,6 +5623,7 @@
     <w:p>
       <w:pPr>
         <w:pStyle w:val="Heading1"/>
+        <w:jc w:val="both"/>
         <w:rPr>
           <w:lang w:val="en-US"/>
         </w:rPr>
@@ -4406,6 +5647,7 @@
       <w:pPr>
         <w:pStyle w:val="Heading2"/>
         <w:ind w:firstLine="0"/>
+        <w:jc w:val="both"/>
         <w:rPr>
           <w:lang w:val="en-US"/>
         </w:rPr>
@@ -4425,6 +5667,7 @@
     </w:p>
     <w:p>
       <w:pPr>
+        <w:jc w:val="both"/>
         <w:rPr>
           <w:b/>
           <w:lang w:val="en-US"/>
@@ -4440,6 +5683,7 @@
     </w:p>
     <w:p>
       <w:pPr>
+        <w:jc w:val="both"/>
         <w:rPr>
           <w:lang w:val="en-US"/>
         </w:rPr>
@@ -4454,6 +5698,7 @@
     <w:p>
       <w:pPr>
         <w:ind w:firstLine="284"/>
+        <w:jc w:val="both"/>
         <w:rPr>
           <w:lang w:val="en-US"/>
         </w:rPr>
@@ -4479,6 +5724,7 @@
     </w:p>
     <w:p>
       <w:pPr>
+        <w:jc w:val="both"/>
         <w:rPr>
           <w:lang w:val="en-US"/>
         </w:rPr>
@@ -4506,13 +5752,15 @@
     </w:p>
     <w:p>
       <w:pPr>
-        <w:rPr>
-          <w:lang w:val="en-US"/>
-        </w:rPr>
-      </w:pPr>
-    </w:p>
-    <w:p>
-      <w:pPr>
+        <w:jc w:val="both"/>
+        <w:rPr>
+          <w:lang w:val="en-US"/>
+        </w:rPr>
+      </w:pPr>
+    </w:p>
+    <w:p>
+      <w:pPr>
+        <w:jc w:val="both"/>
         <w:rPr>
           <w:b/>
           <w:lang w:val="en-US"/>
@@ -4523,11 +5771,13 @@
           <w:b/>
           <w:lang w:val="en-US"/>
         </w:rPr>
+        <w:lastRenderedPageBreak/>
         <w:t>Option B — Written Installation Instructions</w:t>
       </w:r>
     </w:p>
     <w:p>
       <w:pPr>
+        <w:jc w:val="both"/>
         <w:rPr>
           <w:lang w:val="en-US"/>
         </w:rPr>
@@ -4543,6 +5793,7 @@
       <w:pPr>
         <w:pStyle w:val="ListParagraph"/>
         <w:ind w:left="0"/>
+        <w:jc w:val="both"/>
         <w:rPr>
           <w:lang w:val="en-US"/>
         </w:rPr>
@@ -4566,6 +5817,7 @@
       <w:pPr>
         <w:pStyle w:val="ListParagraph"/>
         <w:ind w:left="0"/>
+        <w:jc w:val="both"/>
         <w:rPr>
           <w:lang w:val="en-US"/>
         </w:rPr>
@@ -4584,6 +5836,7 @@
       <w:pPr>
         <w:pStyle w:val="ListParagraph"/>
         <w:ind w:left="0"/>
+        <w:jc w:val="both"/>
         <w:rPr>
           <w:lang w:val="en-US"/>
         </w:rPr>
@@ -4593,6 +5846,7 @@
       <w:pPr>
         <w:pStyle w:val="ListParagraph"/>
         <w:ind w:left="0"/>
+        <w:jc w:val="both"/>
         <w:rPr>
           <w:b/>
           <w:lang w:val="en-US"/>
@@ -4623,6 +5877,7 @@
       <w:pPr>
         <w:pStyle w:val="ListParagraph"/>
         <w:ind w:left="0"/>
+        <w:jc w:val="both"/>
         <w:rPr>
           <w:b/>
           <w:lang w:val="en-US"/>
@@ -4633,6 +5888,7 @@
       <w:pPr>
         <w:pStyle w:val="ListParagraph"/>
         <w:ind w:left="0"/>
+        <w:jc w:val="both"/>
         <w:rPr>
           <w:b/>
           <w:lang w:val="en-US"/>
@@ -4656,6 +5912,7 @@
       <w:pPr>
         <w:pStyle w:val="ListParagraph"/>
         <w:ind w:left="0"/>
+        <w:jc w:val="both"/>
         <w:rPr>
           <w:lang w:val="en-US"/>
         </w:rPr>
@@ -4665,6 +5922,7 @@
       <w:pPr>
         <w:pStyle w:val="ListParagraph"/>
         <w:ind w:left="0"/>
+        <w:jc w:val="both"/>
         <w:rPr>
           <w:b/>
           <w:lang w:val="en-US"/>
@@ -4701,6 +5959,7 @@
       <w:pPr>
         <w:pStyle w:val="ListParagraph"/>
         <w:ind w:left="0"/>
+        <w:jc w:val="both"/>
         <w:rPr>
           <w:b/>
           <w:lang w:val="en-US"/>
@@ -4711,6 +5970,7 @@
       <w:pPr>
         <w:pStyle w:val="ListParagraph"/>
         <w:ind w:left="0"/>
+        <w:jc w:val="both"/>
         <w:rPr>
           <w:b/>
           <w:lang w:val="en-US"/>
@@ -4719,6 +5979,7 @@
     </w:p>
     <w:p>
       <w:pPr>
+        <w:jc w:val="both"/>
         <w:rPr>
           <w:lang w:val="en-US"/>
         </w:rPr>
@@ -4755,6 +6016,7 @@
     </w:p>
     <w:p>
       <w:pPr>
+        <w:jc w:val="both"/>
         <w:rPr>
           <w:lang w:val="en-US"/>
         </w:rPr>
@@ -4782,6 +6044,7 @@
     </w:p>
     <w:p>
       <w:pPr>
+        <w:jc w:val="both"/>
         <w:rPr>
           <w:lang w:val="en-US"/>
         </w:rPr>
@@ -4801,6 +6064,7 @@
     </w:p>
     <w:p>
       <w:pPr>
+        <w:jc w:val="both"/>
         <w:rPr>
           <w:lang w:val="en-US"/>
         </w:rPr>
@@ -4826,6 +6090,7 @@
           <w:numId w:val="41"/>
         </w:numPr>
         <w:ind w:left="900" w:firstLine="0"/>
+        <w:jc w:val="both"/>
         <w:rPr>
           <w:lang w:val="en-US"/>
         </w:rPr>
@@ -4845,15 +6110,15 @@
           <w:numId w:val="41"/>
         </w:numPr>
         <w:ind w:left="900" w:firstLine="0"/>
-        <w:rPr>
-          <w:lang w:val="en-US"/>
-        </w:rPr>
-      </w:pPr>
-      <w:r>
-        <w:rPr>
-          <w:lang w:val="en-US"/>
-        </w:rPr>
-        <w:lastRenderedPageBreak/>
+        <w:jc w:val="both"/>
+        <w:rPr>
+          <w:lang w:val="en-US"/>
+        </w:rPr>
+      </w:pPr>
+      <w:r>
+        <w:rPr>
+          <w:lang w:val="en-US"/>
+        </w:rPr>
         <w:t>A brief description of what happens</w:t>
       </w:r>
     </w:p>
@@ -4865,6 +6130,7 @@
           <w:numId w:val="41"/>
         </w:numPr>
         <w:ind w:left="900" w:firstLine="0"/>
+        <w:jc w:val="both"/>
         <w:rPr>
           <w:lang w:val="en-US"/>
         </w:rPr>
@@ -4884,6 +6150,7 @@
           <w:numId w:val="41"/>
         </w:numPr>
         <w:ind w:left="900" w:firstLine="0"/>
+        <w:jc w:val="both"/>
         <w:rPr>
           <w:lang w:val="en-US"/>
         </w:rPr>
@@ -4910,6 +6177,7 @@
     </w:p>
     <w:p>
       <w:pPr>
+        <w:jc w:val="both"/>
         <w:rPr>
           <w:lang w:val="en-US"/>
         </w:rPr>
@@ -4919,6 +6187,7 @@
       <w:pPr>
         <w:pStyle w:val="Heading2"/>
         <w:ind w:firstLine="0"/>
+        <w:jc w:val="both"/>
         <w:rPr>
           <w:lang w:val="en-US"/>
         </w:rPr>
@@ -4946,6 +6215,7 @@
       <w:pPr>
         <w:pStyle w:val="ListParagraph"/>
         <w:ind w:left="0"/>
+        <w:jc w:val="both"/>
         <w:rPr>
           <w:lang w:val="en-US"/>
         </w:rPr>
@@ -4955,6 +6225,7 @@
       <w:pPr>
         <w:pStyle w:val="ListParagraph"/>
         <w:ind w:left="0"/>
+        <w:jc w:val="both"/>
         <w:rPr>
           <w:lang w:val="en-US"/>
         </w:rPr>
@@ -4978,6 +6249,7 @@
       <w:pPr>
         <w:pStyle w:val="ListParagraph"/>
         <w:ind w:left="0"/>
+        <w:jc w:val="both"/>
         <w:rPr>
           <w:lang w:val="en-US"/>
         </w:rPr>
@@ -4996,6 +6268,7 @@
       <w:pPr>
         <w:pStyle w:val="ListParagraph"/>
         <w:ind w:left="0"/>
+        <w:jc w:val="both"/>
         <w:rPr>
           <w:lang w:val="en-US"/>
         </w:rPr>
@@ -5005,6 +6278,7 @@
       <w:pPr>
         <w:pStyle w:val="ListParagraph"/>
         <w:ind w:left="0"/>
+        <w:jc w:val="both"/>
         <w:rPr>
           <w:lang w:val="en-US"/>
         </w:rPr>
@@ -5034,6 +6308,7 @@
       <w:pPr>
         <w:pStyle w:val="ListParagraph"/>
         <w:ind w:left="0"/>
+        <w:jc w:val="both"/>
         <w:rPr>
           <w:lang w:val="en-US"/>
         </w:rPr>
@@ -5043,6 +6318,7 @@
       <w:pPr>
         <w:pStyle w:val="ListParagraph"/>
         <w:ind w:left="0"/>
+        <w:jc w:val="both"/>
         <w:rPr>
           <w:b/>
           <w:lang w:val="en-US"/>
@@ -5066,6 +6342,7 @@
       <w:pPr>
         <w:pStyle w:val="ListParagraph"/>
         <w:ind w:left="0"/>
+        <w:jc w:val="both"/>
         <w:rPr>
           <w:lang w:val="en-US"/>
         </w:rPr>
@@ -5075,6 +6352,7 @@
       <w:pPr>
         <w:pStyle w:val="ListParagraph"/>
         <w:ind w:left="0"/>
+        <w:jc w:val="both"/>
         <w:rPr>
           <w:b/>
           <w:lang w:val="en-US"/>
@@ -5105,6 +6383,7 @@
       <w:pPr>
         <w:pStyle w:val="ListParagraph"/>
         <w:ind w:left="0"/>
+        <w:jc w:val="both"/>
         <w:rPr>
           <w:rFonts w:ascii="Courier New" w:eastAsia="Courier New" w:hAnsi="Courier New"/>
           <w:sz w:val="20"/>
@@ -5115,7 +6394,9 @@
     <w:p>
       <w:pPr>
         <w:pStyle w:val="ListParagraph"/>
+        <w:shd w:val="clear" w:color="auto" w:fill="E8E8E8" w:themeFill="background2"/>
         <w:ind w:left="0"/>
+        <w:jc w:val="both"/>
         <w:rPr>
           <w:b/>
           <w:lang w:val="en-US"/>
@@ -5144,6 +6425,7 @@
       <w:pPr>
         <w:pStyle w:val="ListParagraph"/>
         <w:ind w:left="0"/>
+        <w:jc w:val="both"/>
         <w:rPr>
           <w:lang w:val="en-US"/>
         </w:rPr>
@@ -5153,6 +6435,7 @@
       <w:pPr>
         <w:pStyle w:val="ListParagraph"/>
         <w:ind w:left="0"/>
+        <w:jc w:val="both"/>
         <w:rPr>
           <w:lang w:val="en-US"/>
         </w:rPr>
@@ -5175,41 +6458,46 @@
       <w:pPr>
         <w:pStyle w:val="ListParagraph"/>
         <w:ind w:left="0"/>
-        <w:rPr>
-          <w:lang w:val="en-US"/>
-        </w:rPr>
-      </w:pPr>
+        <w:jc w:val="both"/>
+        <w:rPr>
+          <w:lang w:val="en-US"/>
+        </w:rPr>
+      </w:pPr>
+    </w:p>
+    <w:p>
+      <w:pPr>
+        <w:pStyle w:val="ListParagraph"/>
+        <w:shd w:val="clear" w:color="auto" w:fill="E8E8E8" w:themeFill="background2"/>
+        <w:ind w:left="0"/>
+        <w:jc w:val="both"/>
+        <w:rPr>
+          <w:rFonts w:ascii="Courier New" w:eastAsia="Courier New" w:hAnsi="Courier New"/>
+          <w:sz w:val="20"/>
+          <w:lang w:val="en-US"/>
+        </w:rPr>
+      </w:pPr>
+      <w:r>
+        <w:rPr>
+          <w:rFonts w:ascii="Courier New" w:eastAsia="Courier New" w:hAnsi="Courier New"/>
+          <w:sz w:val="20"/>
+          <w:lang w:val="en-US"/>
+        </w:rPr>
+        <w:t>./run_easyrob.sh</w:t>
+      </w:r>
     </w:p>
     <w:p>
       <w:pPr>
         <w:pStyle w:val="ListParagraph"/>
         <w:ind w:left="0"/>
-        <w:rPr>
-          <w:rFonts w:ascii="Courier New" w:eastAsia="Courier New" w:hAnsi="Courier New"/>
-          <w:sz w:val="20"/>
-          <w:lang w:val="en-US"/>
-        </w:rPr>
-      </w:pPr>
-      <w:r>
-        <w:rPr>
-          <w:rFonts w:ascii="Courier New" w:eastAsia="Courier New" w:hAnsi="Courier New"/>
-          <w:sz w:val="20"/>
-          <w:lang w:val="en-US"/>
-        </w:rPr>
-        <w:t>./run_easyrob.sh</w:t>
-      </w:r>
-    </w:p>
-    <w:p>
-      <w:pPr>
-        <w:pStyle w:val="ListParagraph"/>
-        <w:ind w:left="0"/>
-        <w:rPr>
-          <w:lang w:val="en-US"/>
-        </w:rPr>
-      </w:pPr>
-    </w:p>
-    <w:p>
-      <w:pPr>
+        <w:jc w:val="both"/>
+        <w:rPr>
+          <w:lang w:val="en-US"/>
+        </w:rPr>
+      </w:pPr>
+    </w:p>
+    <w:p>
+      <w:pPr>
+        <w:jc w:val="both"/>
         <w:rPr>
           <w:lang w:val="en-US"/>
         </w:rPr>
@@ -5238,6 +6526,7 @@
     </w:p>
     <w:p>
       <w:pPr>
+        <w:jc w:val="both"/>
         <w:rPr>
           <w:lang w:val="en-US"/>
         </w:rPr>
@@ -5265,6 +6554,7 @@
     </w:p>
     <w:p>
       <w:pPr>
+        <w:jc w:val="both"/>
         <w:rPr>
           <w:lang w:val="en-US"/>
         </w:rPr>
@@ -5278,6 +6568,7 @@
     </w:p>
     <w:p>
       <w:pPr>
+        <w:jc w:val="both"/>
         <w:rPr>
           <w:lang w:val="en-US"/>
         </w:rPr>
@@ -5297,6 +6588,7 @@
           <w:numId w:val="41"/>
         </w:numPr>
         <w:ind w:left="900" w:firstLine="0"/>
+        <w:jc w:val="both"/>
         <w:rPr>
           <w:lang w:val="en-US"/>
         </w:rPr>
@@ -5316,6 +6608,7 @@
           <w:numId w:val="41"/>
         </w:numPr>
         <w:ind w:left="900" w:firstLine="0"/>
+        <w:jc w:val="both"/>
         <w:rPr>
           <w:lang w:val="en-US"/>
         </w:rPr>
@@ -5335,6 +6628,7 @@
           <w:numId w:val="41"/>
         </w:numPr>
         <w:ind w:left="900" w:firstLine="0"/>
+        <w:jc w:val="both"/>
         <w:rPr>
           <w:lang w:val="en-US"/>
         </w:rPr>
@@ -5354,6 +6648,7 @@
           <w:numId w:val="41"/>
         </w:numPr>
         <w:ind w:left="900" w:firstLine="0"/>
+        <w:jc w:val="both"/>
         <w:rPr>
           <w:lang w:val="en-US"/>
         </w:rPr>
@@ -5380,6 +6675,7 @@
     </w:p>
     <w:p>
       <w:pPr>
+        <w:jc w:val="both"/>
         <w:rPr>
           <w:lang w:val="en-US"/>
         </w:rPr>
@@ -5389,6 +6685,7 @@
       <w:pPr>
         <w:pStyle w:val="Heading2"/>
         <w:ind w:firstLine="0"/>
+        <w:jc w:val="both"/>
         <w:rPr>
           <w:lang w:val="en-US"/>
         </w:rPr>
@@ -5428,6 +6725,7 @@
     </w:p>
     <w:p>
       <w:pPr>
+        <w:jc w:val="both"/>
         <w:rPr>
           <w:lang w:val="en-US"/>
         </w:rPr>
@@ -5456,6 +6754,7 @@
     <w:p>
       <w:pPr>
         <w:pStyle w:val="Heading3"/>
+        <w:jc w:val="both"/>
         <w:rPr>
           <w:b/>
           <w:lang w:val="en-US"/>
@@ -5471,6 +6770,7 @@
     </w:p>
     <w:p>
       <w:pPr>
+        <w:jc w:val="both"/>
         <w:rPr>
           <w:lang w:val="en-US"/>
         </w:rPr>
@@ -5480,6 +6780,7 @@
       <w:pPr>
         <w:pStyle w:val="ListParagraph"/>
         <w:ind w:left="0"/>
+        <w:jc w:val="both"/>
         <w:rPr>
           <w:lang w:val="en-US"/>
         </w:rPr>
@@ -5507,6 +6808,7 @@
       <w:pPr>
         <w:pStyle w:val="ListParagraph"/>
         <w:ind w:left="0"/>
+        <w:jc w:val="both"/>
         <w:rPr>
           <w:lang w:val="en-US"/>
         </w:rPr>
@@ -5516,6 +6818,7 @@
       <w:pPr>
         <w:pStyle w:val="ListParagraph"/>
         <w:ind w:left="0"/>
+        <w:jc w:val="both"/>
         <w:rPr>
           <w:lang w:val="en-US"/>
         </w:rPr>
@@ -5538,15 +6841,15 @@
       <w:pPr>
         <w:pStyle w:val="ListParagraph"/>
         <w:ind w:left="0"/>
-        <w:rPr>
-          <w:lang w:val="en-US"/>
-        </w:rPr>
-      </w:pPr>
-      <w:r>
-        <w:rPr>
-          <w:lang w:val="en-US"/>
-        </w:rPr>
-        <w:lastRenderedPageBreak/>
+        <w:jc w:val="both"/>
+        <w:rPr>
+          <w:lang w:val="en-US"/>
+        </w:rPr>
+      </w:pPr>
+      <w:r>
+        <w:rPr>
+          <w:lang w:val="en-US"/>
+        </w:rPr>
         <w:t xml:space="preserve">Open </w:t>
       </w:r>
       <w:r>
@@ -5567,6 +6870,7 @@
       <w:pPr>
         <w:pStyle w:val="ListParagraph"/>
         <w:ind w:left="0"/>
+        <w:jc w:val="both"/>
         <w:rPr>
           <w:lang w:val="en-US"/>
         </w:rPr>
@@ -5576,6 +6880,7 @@
       <w:pPr>
         <w:pStyle w:val="ListParagraph"/>
         <w:ind w:left="0"/>
+        <w:jc w:val="both"/>
         <w:rPr>
           <w:lang w:val="en-US"/>
         </w:rPr>
@@ -5598,6 +6903,7 @@
       <w:pPr>
         <w:pStyle w:val="ListParagraph"/>
         <w:ind w:left="0"/>
+        <w:jc w:val="both"/>
         <w:rPr>
           <w:lang w:val="en-US"/>
         </w:rPr>
@@ -5627,6 +6933,7 @@
       <w:pPr>
         <w:pStyle w:val="ListParagraph"/>
         <w:ind w:left="0"/>
+        <w:jc w:val="both"/>
         <w:rPr>
           <w:lang w:val="en-US"/>
         </w:rPr>
@@ -5636,6 +6943,7 @@
       <w:pPr>
         <w:pStyle w:val="ListParagraph"/>
         <w:ind w:left="0"/>
+        <w:jc w:val="both"/>
         <w:rPr>
           <w:lang w:val="en-US"/>
         </w:rPr>
@@ -5658,6 +6966,7 @@
       <w:pPr>
         <w:pStyle w:val="ListParagraph"/>
         <w:ind w:left="0"/>
+        <w:jc w:val="both"/>
         <w:rPr>
           <w:lang w:val="en-US"/>
         </w:rPr>
@@ -5673,6 +6982,7 @@
       <w:pPr>
         <w:pStyle w:val="ListParagraph"/>
         <w:ind w:left="0"/>
+        <w:jc w:val="both"/>
         <w:rPr>
           <w:lang w:val="en-US"/>
         </w:rPr>
@@ -5682,6 +6992,7 @@
       <w:pPr>
         <w:pStyle w:val="ListParagraph"/>
         <w:ind w:left="0"/>
+        <w:jc w:val="both"/>
         <w:rPr>
           <w:lang w:val="en-US"/>
         </w:rPr>
@@ -5717,104 +7028,111 @@
       <w:pPr>
         <w:pStyle w:val="ListParagraph"/>
         <w:ind w:left="0"/>
-        <w:rPr>
-          <w:lang w:val="en-US"/>
-        </w:rPr>
-      </w:pPr>
+        <w:jc w:val="both"/>
+        <w:rPr>
+          <w:lang w:val="en-US"/>
+        </w:rPr>
+      </w:pPr>
+    </w:p>
+    <w:p>
+      <w:pPr>
+        <w:pStyle w:val="ListParagraph"/>
+        <w:shd w:val="clear" w:color="auto" w:fill="E8E8E8" w:themeFill="background2"/>
+        <w:ind w:left="0"/>
+        <w:jc w:val="both"/>
+        <w:rPr>
+          <w:lang w:val="en-US"/>
+        </w:rPr>
+      </w:pPr>
+      <w:proofErr w:type="spellStart"/>
+      <w:r>
+        <w:rPr>
+          <w:rFonts w:ascii="Courier New" w:eastAsia="Courier New" w:hAnsi="Courier New"/>
+          <w:sz w:val="20"/>
+          <w:lang w:val="en-US"/>
+        </w:rPr>
+        <w:t>conda</w:t>
+      </w:r>
+      <w:proofErr w:type="spellEnd"/>
+      <w:r>
+        <w:rPr>
+          <w:rFonts w:ascii="Courier New" w:eastAsia="Courier New" w:hAnsi="Courier New"/>
+          <w:sz w:val="20"/>
+          <w:lang w:val="en-US"/>
+        </w:rPr>
+        <w:t xml:space="preserve"> activate </w:t>
+      </w:r>
+      <w:proofErr w:type="spellStart"/>
+      <w:r>
+        <w:rPr>
+          <w:rFonts w:ascii="Courier New" w:eastAsia="Courier New" w:hAnsi="Courier New"/>
+          <w:sz w:val="20"/>
+          <w:lang w:val="en-US"/>
+        </w:rPr>
+        <w:t>cheminf</w:t>
+      </w:r>
+      <w:proofErr w:type="spellEnd"/>
     </w:p>
     <w:p>
       <w:pPr>
         <w:pStyle w:val="ListParagraph"/>
         <w:ind w:left="0"/>
-        <w:rPr>
-          <w:lang w:val="en-US"/>
-        </w:rPr>
-      </w:pPr>
-      <w:proofErr w:type="spellStart"/>
-      <w:r>
-        <w:rPr>
-          <w:rFonts w:ascii="Courier New" w:eastAsia="Courier New" w:hAnsi="Courier New"/>
-          <w:sz w:val="20"/>
-          <w:lang w:val="en-US"/>
-        </w:rPr>
-        <w:t>conda</w:t>
-      </w:r>
-      <w:proofErr w:type="spellEnd"/>
-      <w:r>
-        <w:rPr>
-          <w:rFonts w:ascii="Courier New" w:eastAsia="Courier New" w:hAnsi="Courier New"/>
-          <w:sz w:val="20"/>
-          <w:lang w:val="en-US"/>
-        </w:rPr>
-        <w:t xml:space="preserve"> activate </w:t>
-      </w:r>
-      <w:proofErr w:type="spellStart"/>
-      <w:r>
-        <w:rPr>
-          <w:rFonts w:ascii="Courier New" w:eastAsia="Courier New" w:hAnsi="Courier New"/>
-          <w:sz w:val="20"/>
-          <w:lang w:val="en-US"/>
-        </w:rPr>
-        <w:t>cheminf</w:t>
-      </w:r>
-      <w:proofErr w:type="spellEnd"/>
+        <w:jc w:val="both"/>
+        <w:rPr>
+          <w:lang w:val="en-US"/>
+        </w:rPr>
+      </w:pPr>
     </w:p>
     <w:p>
       <w:pPr>
         <w:pStyle w:val="ListParagraph"/>
         <w:ind w:left="0"/>
-        <w:rPr>
-          <w:lang w:val="en-US"/>
-        </w:rPr>
-      </w:pPr>
+        <w:jc w:val="both"/>
+        <w:rPr>
+          <w:lang w:val="en-US"/>
+        </w:rPr>
+      </w:pPr>
+      <w:r>
+        <w:rPr>
+          <w:lang w:val="en-US"/>
+        </w:rPr>
+        <w:t xml:space="preserve">7.3.3. </w:t>
+      </w:r>
+      <w:r>
+        <w:rPr>
+          <w:lang w:val="en-US"/>
+        </w:rPr>
+        <w:t xml:space="preserve">Download </w:t>
+      </w:r>
+      <w:r>
+        <w:rPr>
+          <w:b/>
+          <w:lang w:val="en-US"/>
+        </w:rPr>
+        <w:t>easyrob.py</w:t>
+      </w:r>
+      <w:r>
+        <w:rPr>
+          <w:lang w:val="en-US"/>
+        </w:rPr>
+        <w:t xml:space="preserve"> from:</w:t>
+      </w:r>
     </w:p>
     <w:p>
       <w:pPr>
         <w:pStyle w:val="ListParagraph"/>
         <w:ind w:left="0"/>
-        <w:rPr>
-          <w:lang w:val="en-US"/>
-        </w:rPr>
-      </w:pPr>
-      <w:r>
-        <w:rPr>
-          <w:lang w:val="en-US"/>
-        </w:rPr>
-        <w:t xml:space="preserve">7.3.3. </w:t>
-      </w:r>
-      <w:r>
-        <w:rPr>
-          <w:lang w:val="en-US"/>
-        </w:rPr>
-        <w:t xml:space="preserve">Download </w:t>
-      </w:r>
-      <w:r>
-        <w:rPr>
-          <w:b/>
-          <w:lang w:val="en-US"/>
-        </w:rPr>
-        <w:t>easyrob.py</w:t>
-      </w:r>
-      <w:r>
-        <w:rPr>
-          <w:lang w:val="en-US"/>
-        </w:rPr>
-        <w:t xml:space="preserve"> from:</w:t>
-      </w:r>
+        <w:jc w:val="both"/>
+        <w:rPr>
+          <w:lang w:val="en-US"/>
+        </w:rPr>
+      </w:pPr>
     </w:p>
     <w:p>
       <w:pPr>
         <w:pStyle w:val="ListParagraph"/>
         <w:ind w:left="0"/>
-        <w:rPr>
-          <w:lang w:val="en-US"/>
-        </w:rPr>
-      </w:pPr>
-    </w:p>
-    <w:p>
-      <w:pPr>
-        <w:pStyle w:val="ListParagraph"/>
-        <w:ind w:left="0"/>
+        <w:jc w:val="both"/>
         <w:rPr>
           <w:lang w:val="en-US"/>
         </w:rPr>
@@ -5833,6 +7151,7 @@
       <w:pPr>
         <w:pStyle w:val="ListParagraph"/>
         <w:ind w:left="0"/>
+        <w:jc w:val="both"/>
         <w:rPr>
           <w:lang w:val="en-US"/>
         </w:rPr>
@@ -5910,6 +7229,7 @@
       <w:pPr>
         <w:pStyle w:val="ListParagraph"/>
         <w:ind w:left="0"/>
+        <w:jc w:val="both"/>
         <w:rPr>
           <w:lang w:val="en-US"/>
         </w:rPr>
@@ -5931,6 +7251,7 @@
       <w:pPr>
         <w:pStyle w:val="ListParagraph"/>
         <w:ind w:left="0"/>
+        <w:jc w:val="both"/>
         <w:rPr>
           <w:lang w:val="en-US"/>
         </w:rPr>
@@ -5940,6 +7261,7 @@
       <w:pPr>
         <w:pStyle w:val="ListParagraph"/>
         <w:ind w:left="0"/>
+        <w:jc w:val="both"/>
         <w:rPr>
           <w:lang w:val="en-US"/>
         </w:rPr>
@@ -5949,6 +7271,7 @@
       <w:pPr>
         <w:pStyle w:val="ListParagraph"/>
         <w:ind w:left="0"/>
+        <w:jc w:val="both"/>
         <w:rPr>
           <w:lang w:val="en-US"/>
         </w:rPr>
@@ -5976,106 +7299,115 @@
       <w:pPr>
         <w:pStyle w:val="ListParagraph"/>
         <w:ind w:left="0"/>
-        <w:rPr>
-          <w:lang w:val="en-US"/>
-        </w:rPr>
-      </w:pPr>
+        <w:jc w:val="both"/>
+        <w:rPr>
+          <w:lang w:val="en-US"/>
+        </w:rPr>
+      </w:pPr>
+    </w:p>
+    <w:p>
+      <w:pPr>
+        <w:pStyle w:val="ListParagraph"/>
+        <w:shd w:val="clear" w:color="auto" w:fill="E8E8E8" w:themeFill="background2"/>
+        <w:ind w:left="0"/>
+        <w:jc w:val="both"/>
+        <w:rPr>
+          <w:rFonts w:ascii="Courier New" w:eastAsia="Courier New" w:hAnsi="Courier New"/>
+          <w:sz w:val="20"/>
+          <w:lang w:val="en-US"/>
+        </w:rPr>
+      </w:pPr>
+      <w:r>
+        <w:rPr>
+          <w:rFonts w:ascii="Courier New" w:eastAsia="Courier New" w:hAnsi="Courier New"/>
+          <w:sz w:val="20"/>
+          <w:lang w:val="en-US"/>
+        </w:rPr>
+        <w:t>cd /path/to/your/folder</w:t>
+      </w:r>
     </w:p>
     <w:p>
       <w:pPr>
         <w:pStyle w:val="ListParagraph"/>
         <w:ind w:left="0"/>
+        <w:jc w:val="both"/>
         <w:rPr>
           <w:rFonts w:ascii="Courier New" w:eastAsia="Courier New" w:hAnsi="Courier New"/>
           <w:sz w:val="20"/>
           <w:lang w:val="en-US"/>
         </w:rPr>
       </w:pPr>
-      <w:r>
+    </w:p>
+    <w:p>
+      <w:pPr>
+        <w:pStyle w:val="ListParagraph"/>
+        <w:ind w:left="0"/>
+        <w:jc w:val="both"/>
+        <w:rPr>
+          <w:lang w:val="en-US"/>
+        </w:rPr>
+      </w:pPr>
+    </w:p>
+    <w:p>
+      <w:pPr>
+        <w:pStyle w:val="ListParagraph"/>
+        <w:ind w:left="0"/>
+        <w:jc w:val="both"/>
+        <w:rPr>
+          <w:lang w:val="en-US"/>
+        </w:rPr>
+      </w:pPr>
+      <w:r>
+        <w:rPr>
+          <w:lang w:val="en-US"/>
+        </w:rPr>
+        <w:t xml:space="preserve">7.3.5. </w:t>
+      </w:r>
+      <w:r>
+        <w:rPr>
+          <w:lang w:val="en-US"/>
+        </w:rPr>
+        <w:t>L</w:t>
+      </w:r>
+      <w:r>
+        <w:rPr>
+          <w:lang w:val="en-US"/>
+        </w:rPr>
+        <w:t xml:space="preserve">aunch </w:t>
+      </w:r>
+      <w:proofErr w:type="spellStart"/>
+      <w:r>
+        <w:rPr>
+          <w:lang w:val="en-US"/>
+        </w:rPr>
+        <w:t>easyROB</w:t>
+      </w:r>
+      <w:proofErr w:type="spellEnd"/>
+      <w:r>
+        <w:rPr>
+          <w:lang w:val="en-US"/>
+        </w:rPr>
+        <w:t xml:space="preserve"> by running:</w:t>
+      </w:r>
+    </w:p>
+    <w:p>
+      <w:pPr>
+        <w:pStyle w:val="ListParagraph"/>
+        <w:ind w:left="0"/>
+        <w:jc w:val="both"/>
         <w:rPr>
           <w:rFonts w:ascii="Courier New" w:eastAsia="Courier New" w:hAnsi="Courier New"/>
           <w:sz w:val="20"/>
           <w:lang w:val="en-US"/>
         </w:rPr>
-        <w:t>cd /path/to/your/folder</w:t>
-      </w:r>
+      </w:pPr>
     </w:p>
     <w:p>
       <w:pPr>
         <w:pStyle w:val="ListParagraph"/>
+        <w:shd w:val="clear" w:color="auto" w:fill="E8E8E8" w:themeFill="background2"/>
         <w:ind w:left="0"/>
-        <w:rPr>
-          <w:rFonts w:ascii="Courier New" w:eastAsia="Courier New" w:hAnsi="Courier New"/>
-          <w:sz w:val="20"/>
-          <w:lang w:val="en-US"/>
-        </w:rPr>
-      </w:pPr>
-    </w:p>
-    <w:p>
-      <w:pPr>
-        <w:pStyle w:val="ListParagraph"/>
-        <w:ind w:left="0"/>
-        <w:rPr>
-          <w:lang w:val="en-US"/>
-        </w:rPr>
-      </w:pPr>
-    </w:p>
-    <w:p>
-      <w:pPr>
-        <w:pStyle w:val="ListParagraph"/>
-        <w:ind w:left="0"/>
-        <w:rPr>
-          <w:lang w:val="en-US"/>
-        </w:rPr>
-      </w:pPr>
-      <w:r>
-        <w:rPr>
-          <w:lang w:val="en-US"/>
-        </w:rPr>
-        <w:t xml:space="preserve">7.3.5. </w:t>
-      </w:r>
-      <w:r>
-        <w:rPr>
-          <w:lang w:val="en-US"/>
-        </w:rPr>
-        <w:t>L</w:t>
-      </w:r>
-      <w:r>
-        <w:rPr>
-          <w:lang w:val="en-US"/>
-        </w:rPr>
-        <w:t xml:space="preserve">aunch </w:t>
-      </w:r>
-      <w:proofErr w:type="spellStart"/>
-      <w:r>
-        <w:rPr>
-          <w:lang w:val="en-US"/>
-        </w:rPr>
-        <w:t>easyROB</w:t>
-      </w:r>
-      <w:proofErr w:type="spellEnd"/>
-      <w:r>
-        <w:rPr>
-          <w:lang w:val="en-US"/>
-        </w:rPr>
-        <w:t xml:space="preserve"> by running:</w:t>
-      </w:r>
-    </w:p>
-    <w:p>
-      <w:pPr>
-        <w:pStyle w:val="ListParagraph"/>
-        <w:ind w:left="0"/>
-        <w:rPr>
-          <w:rFonts w:ascii="Courier New" w:eastAsia="Courier New" w:hAnsi="Courier New"/>
-          <w:sz w:val="20"/>
-          <w:lang w:val="en-US"/>
-        </w:rPr>
-      </w:pPr>
-    </w:p>
-    <w:p>
-      <w:pPr>
-        <w:pStyle w:val="ListParagraph"/>
-        <w:ind w:left="0"/>
+        <w:jc w:val="both"/>
         <w:rPr>
           <w:rFonts w:ascii="Courier New" w:eastAsia="Courier New" w:hAnsi="Courier New"/>
           <w:sz w:val="20"/>

</xml_diff>